<commit_message>
REVISI SRS VERSI 1.3 BAB VII
</commit_message>
<xml_diff>
--- a/srs_hutch.id_Kel2_REAL.docx
+++ b/srs_hutch.id_Kel2_REAL.docx
@@ -41,7 +41,23 @@
           <w:sz w:val="24"/>
           <w:szCs w:val="24"/>
         </w:rPr>
-        <w:t>IEEE 830  ·  Versi 1.2  ·  April 2026</w:t>
+        <w:t>IEEE 830  ·  Versi 1.</w:t>
+      </w:r>
+      <w:r>
+        <w:rPr>
+          <w:rFonts w:ascii="Times New Roman" w:eastAsia="Times New Roman" w:hAnsi="Times New Roman" w:cs="Times New Roman"/>
+          <w:sz w:val="24"/>
+          <w:szCs w:val="24"/>
+        </w:rPr>
+        <w:t xml:space="preserve">3 </w:t>
+      </w:r>
+      <w:r>
+        <w:rPr>
+          <w:rFonts w:ascii="Times New Roman" w:eastAsia="Times New Roman" w:hAnsi="Times New Roman" w:cs="Times New Roman"/>
+          <w:sz w:val="24"/>
+          <w:szCs w:val="24"/>
+        </w:rPr>
+        <w:t xml:space="preserve"> ·  April 2026</w:t>
       </w:r>
     </w:p>
     <w:p>
@@ -823,6 +839,14 @@
                 <w:szCs w:val="24"/>
               </w:rPr>
               <w:t xml:space="preserve"> Gustari (20241320034)</w:t>
+            </w:r>
+            <w:r>
+              <w:rPr>
+                <w:rFonts w:ascii="Times New Roman" w:eastAsia="Times New Roman" w:hAnsi="Times New Roman" w:cs="Times New Roman"/>
+                <w:sz w:val="24"/>
+                <w:szCs w:val="24"/>
+              </w:rPr>
+              <w:t xml:space="preserve"> </w:t>
             </w:r>
           </w:p>
           <w:p>
@@ -2601,7 +2625,18 @@
                 <w:sz w:val="24"/>
                 <w:szCs w:val="24"/>
               </w:rPr>
-              <w:t>BAB V - PERSYARATAN NON-FUNGSIONAL5.1 Persyaratan Kinerja</w:t>
+              <w:t>BAB V - PERSYARATAN NON-FUNGSIONAL</w:t>
+            </w:r>
+            <w:r>
+              <w:rPr>
+                <w:rFonts w:ascii="Times New Roman" w:eastAsia="Times New Roman" w:hAnsi="Times New Roman" w:cs="Times New Roman"/>
+                <w:b/>
+                <w:bCs/>
+                <w:color w:val="000000"/>
+                <w:sz w:val="24"/>
+                <w:szCs w:val="24"/>
+              </w:rPr>
+              <w:t>5.1 Persyaratan Kinerja</w:t>
             </w:r>
             <w:r>
               <w:rPr>
@@ -2717,7 +2752,29 @@
                 <w:sz w:val="24"/>
                 <w:szCs w:val="24"/>
               </w:rPr>
-              <w:t>BAB VI - DESAIN BASIS DATA6.1 Entitas dan Atribut</w:t>
+              <w:t>BAB VI - DESAIN BASIS DATA</w:t>
+            </w:r>
+            <w:r>
+              <w:rPr>
+                <w:rFonts w:ascii="Times New Roman" w:eastAsia="Times New Roman" w:hAnsi="Times New Roman" w:cs="Times New Roman"/>
+                <w:b/>
+                <w:bCs/>
+                <w:color w:val="000000"/>
+                <w:sz w:val="24"/>
+                <w:szCs w:val="24"/>
+              </w:rPr>
+              <w:t xml:space="preserve"> </w:t>
+            </w:r>
+            <w:r>
+              <w:rPr>
+                <w:rFonts w:ascii="Times New Roman" w:eastAsia="Times New Roman" w:hAnsi="Times New Roman" w:cs="Times New Roman"/>
+                <w:b/>
+                <w:bCs/>
+                <w:color w:val="000000"/>
+                <w:sz w:val="24"/>
+                <w:szCs w:val="24"/>
+              </w:rPr>
+              <w:t>6.1 Entitas dan Atribut</w:t>
             </w:r>
             <w:r>
               <w:rPr>
@@ -2806,6 +2863,145 @@
               <w:t>36</w:t>
             </w:r>
           </w:hyperlink>
+        </w:p>
+        <w:p>
+          <w:pPr>
+            <w:widowControl w:val="0"/>
+            <w:tabs>
+              <w:tab w:val="right" w:leader="dot" w:pos="12000"/>
+            </w:tabs>
+            <w:spacing w:before="60" w:line="360" w:lineRule="auto"/>
+            <w:rPr>
+              <w:rFonts w:ascii="Times New Roman" w:eastAsia="Times New Roman" w:hAnsi="Times New Roman" w:cs="Times New Roman"/>
+              <w:b/>
+              <w:bCs/>
+              <w:color w:val="000000"/>
+              <w:sz w:val="24"/>
+              <w:szCs w:val="24"/>
+            </w:rPr>
+          </w:pPr>
+          <w:r>
+            <w:rPr>
+              <w:rFonts w:ascii="Times New Roman" w:eastAsia="Times New Roman" w:hAnsi="Times New Roman" w:cs="Times New Roman"/>
+              <w:b/>
+              <w:bCs/>
+              <w:color w:val="000000"/>
+              <w:sz w:val="24"/>
+              <w:szCs w:val="24"/>
+            </w:rPr>
+            <w:t xml:space="preserve">BAB VII - </w:t>
+          </w:r>
+          <w:r>
+            <w:rPr>
+              <w:rFonts w:ascii="Times New Roman" w:eastAsia="Times New Roman" w:hAnsi="Times New Roman" w:cs="Times New Roman"/>
+              <w:b/>
+              <w:bCs/>
+              <w:color w:val="000000"/>
+              <w:sz w:val="24"/>
+              <w:szCs w:val="24"/>
+            </w:rPr>
+            <w:t xml:space="preserve">MANAJEMEN PROYEK DAN PEMBAGIAN TUGAS TIM </w:t>
+          </w:r>
+        </w:p>
+        <w:p>
+          <w:pPr>
+            <w:widowControl w:val="0"/>
+            <w:tabs>
+              <w:tab w:val="right" w:leader="dot" w:pos="12000"/>
+            </w:tabs>
+            <w:spacing w:before="60" w:line="360" w:lineRule="auto"/>
+            <w:ind w:left="426"/>
+            <w:rPr>
+              <w:rFonts w:ascii="Times New Roman" w:eastAsia="Times New Roman" w:hAnsi="Times New Roman" w:cs="Times New Roman"/>
+              <w:color w:val="000000"/>
+              <w:sz w:val="24"/>
+              <w:szCs w:val="24"/>
+            </w:rPr>
+          </w:pPr>
+          <w:r>
+            <w:rPr>
+              <w:rFonts w:ascii="Times New Roman" w:eastAsia="Times New Roman" w:hAnsi="Times New Roman" w:cs="Times New Roman"/>
+              <w:color w:val="000000"/>
+              <w:sz w:val="24"/>
+              <w:szCs w:val="24"/>
+            </w:rPr>
+            <w:t>7.1 STRUKTUR TIM PROJEK'</w:t>
+          </w:r>
+        </w:p>
+        <w:p>
+          <w:pPr>
+            <w:widowControl w:val="0"/>
+            <w:tabs>
+              <w:tab w:val="right" w:leader="dot" w:pos="12000"/>
+            </w:tabs>
+            <w:spacing w:before="60" w:line="360" w:lineRule="auto"/>
+            <w:ind w:left="426"/>
+            <w:rPr>
+              <w:rFonts w:ascii="Times New Roman" w:eastAsia="Times New Roman" w:hAnsi="Times New Roman" w:cs="Times New Roman"/>
+              <w:color w:val="000000"/>
+              <w:sz w:val="24"/>
+              <w:szCs w:val="24"/>
+            </w:rPr>
+          </w:pPr>
+          <w:r>
+            <w:rPr>
+              <w:rFonts w:ascii="Times New Roman" w:eastAsia="Times New Roman" w:hAnsi="Times New Roman" w:cs="Times New Roman"/>
+              <w:color w:val="000000"/>
+              <w:sz w:val="24"/>
+              <w:szCs w:val="24"/>
+            </w:rPr>
+            <w:t>7.2 PEMBAGIAN TUGAS DAN TANGGUNG JAWAB</w:t>
+          </w:r>
+        </w:p>
+        <w:p>
+          <w:pPr>
+            <w:widowControl w:val="0"/>
+            <w:tabs>
+              <w:tab w:val="right" w:leader="dot" w:pos="12000"/>
+            </w:tabs>
+            <w:spacing w:before="60" w:line="360" w:lineRule="auto"/>
+            <w:ind w:left="426"/>
+            <w:rPr>
+              <w:rFonts w:ascii="Times New Roman" w:eastAsia="Times New Roman" w:hAnsi="Times New Roman" w:cs="Times New Roman"/>
+              <w:color w:val="000000"/>
+              <w:sz w:val="24"/>
+              <w:szCs w:val="24"/>
+            </w:rPr>
+          </w:pPr>
+          <w:r>
+            <w:rPr>
+              <w:rFonts w:ascii="Times New Roman" w:eastAsia="Times New Roman" w:hAnsi="Times New Roman" w:cs="Times New Roman"/>
+              <w:color w:val="000000"/>
+              <w:sz w:val="24"/>
+              <w:szCs w:val="24"/>
+            </w:rPr>
+            <w:t>7.3 MEKANISME KOORDINASI TIM</w:t>
+          </w:r>
+        </w:p>
+        <w:p>
+          <w:pPr>
+            <w:widowControl w:val="0"/>
+            <w:tabs>
+              <w:tab w:val="right" w:leader="dot" w:pos="12000"/>
+            </w:tabs>
+            <w:spacing w:before="60" w:line="360" w:lineRule="auto"/>
+            <w:ind w:left="426"/>
+            <w:rPr>
+              <w:rFonts w:ascii="Times New Roman" w:eastAsia="Times New Roman" w:hAnsi="Times New Roman" w:cs="Times New Roman"/>
+              <w:color w:val="000000"/>
+              <w:sz w:val="24"/>
+              <w:szCs w:val="24"/>
+            </w:rPr>
+          </w:pPr>
+          <w:r>
+            <w:rPr>
+              <w:rFonts w:ascii="Times New Roman" w:eastAsia="Times New Roman" w:hAnsi="Times New Roman" w:cs="Times New Roman"/>
+              <w:color w:val="000000"/>
+              <w:sz w:val="24"/>
+              <w:szCs w:val="24"/>
+            </w:rPr>
+            <w:t>7.4 TUJUAN PEMBAGIAN TUGAS</w:t>
+          </w:r>
         </w:p>
         <w:p>
           <w:pPr>
@@ -4022,12 +4218,11 @@
       <w:bookmarkStart w:id="6" w:name="_d4tl4exe0f1y" w:colFirst="0" w:colLast="0"/>
       <w:bookmarkEnd w:id="6"/>
       <w:r>
-        <w:lastRenderedPageBreak/>
         <w:t>BAB I - PENDAHULUAN</w:t>
       </w:r>
       <w:r>
         <w:pict w14:anchorId="1AB4335F">
-          <v:rect id="_x0000_i1026" style="width:0;height:1.5pt" o:hralign="center" o:hrstd="t" o:hr="t" fillcolor="#a0a0a0" stroked="f"/>
+          <v:rect id="_x0000_i1246" style="width:0;height:1.5pt" o:hralign="center" o:hrstd="t" o:hr="t" fillcolor="#a0a0a0" stroked="f"/>
         </w:pict>
       </w:r>
       <w:r>
@@ -4833,7 +5028,6 @@
                 <w:sz w:val="24"/>
                 <w:szCs w:val="24"/>
               </w:rPr>
-              <w:lastRenderedPageBreak/>
               <w:t>Prioritas: T</w:t>
             </w:r>
           </w:p>
@@ -5626,7 +5820,6 @@
           <w:sz w:val="24"/>
           <w:szCs w:val="24"/>
         </w:rPr>
-        <w:lastRenderedPageBreak/>
         <w:t xml:space="preserve">Modul ini tidak mencakup proses pembayaran </w:t>
       </w:r>
       <w:proofErr w:type="spellStart"/>
@@ -6108,12 +6301,11 @@
       <w:bookmarkStart w:id="11" w:name="_7axojpsz769r" w:colFirst="0" w:colLast="0"/>
       <w:bookmarkEnd w:id="11"/>
       <w:r>
-        <w:lastRenderedPageBreak/>
         <w:t>BAB II - DESKRIPSI UMUM</w:t>
       </w:r>
       <w:r>
         <w:pict w14:anchorId="0E23944A">
-          <v:rect id="_x0000_i1027" style="width:0;height:1.5pt" o:hralign="center" o:hrstd="t" o:hr="t" fillcolor="#a0a0a0" stroked="f"/>
+          <v:rect id="_x0000_i1247" style="width:0;height:1.5pt" o:hralign="center" o:hrstd="t" o:hr="t" fillcolor="#a0a0a0" stroked="f"/>
         </w:pict>
       </w:r>
     </w:p>
@@ -6968,7 +7160,6 @@
                 <w:sz w:val="24"/>
                 <w:szCs w:val="24"/>
               </w:rPr>
-              <w:lastRenderedPageBreak/>
               <w:t>Daftar &amp; Filter Pesanan</w:t>
             </w:r>
           </w:p>
@@ -7918,7 +8109,6 @@
       <w:bookmarkStart w:id="15" w:name="_pdv5tai9clmi" w:colFirst="0" w:colLast="0"/>
       <w:bookmarkEnd w:id="15"/>
       <w:r>
-        <w:lastRenderedPageBreak/>
         <w:t>2.4 Lingkungan Operasi</w:t>
       </w:r>
     </w:p>
@@ -8555,6 +8745,17 @@
     </w:p>
     <w:p>
       <w:pPr>
+        <w:spacing w:after="80" w:line="360" w:lineRule="auto"/>
+        <w:ind w:left="720" w:hanging="240"/>
+        <w:rPr>
+          <w:rFonts w:ascii="Times New Roman" w:eastAsia="Times New Roman" w:hAnsi="Times New Roman" w:cs="Times New Roman"/>
+          <w:sz w:val="24"/>
+          <w:szCs w:val="24"/>
+        </w:rPr>
+      </w:pPr>
+    </w:p>
+    <w:p>
+      <w:pPr>
         <w:spacing w:line="360" w:lineRule="auto"/>
         <w:rPr>
           <w:rFonts w:ascii="Times New Roman" w:eastAsia="Times New Roman" w:hAnsi="Times New Roman" w:cs="Times New Roman"/>
@@ -8657,7 +8858,6 @@
       <w:bookmarkStart w:id="18" w:name="_7888nr3knnk1" w:colFirst="0" w:colLast="0"/>
       <w:bookmarkEnd w:id="18"/>
       <w:r>
-        <w:lastRenderedPageBreak/>
         <w:t xml:space="preserve">BAB III - ANTARMUKA EKSTERNAL </w:t>
       </w:r>
     </w:p>
@@ -8671,7 +8871,7 @@
       <w:bookmarkEnd w:id="19"/>
       <w:r>
         <w:pict w14:anchorId="05FC8705">
-          <v:rect id="_x0000_i1028" style="width:0;height:1.5pt" o:hralign="center" o:hrstd="t" o:hr="t" fillcolor="#a0a0a0" stroked="f"/>
+          <v:rect id="_x0000_i1248" style="width:0;height:1.5pt" o:hralign="center" o:hrstd="t" o:hr="t" fillcolor="#a0a0a0" stroked="f"/>
         </w:pict>
       </w:r>
       <w:r>
@@ -9494,7 +9694,6 @@
                 <w:sz w:val="28"/>
                 <w:szCs w:val="28"/>
               </w:rPr>
-              <w:lastRenderedPageBreak/>
               <w:t xml:space="preserve">Halaman </w:t>
             </w:r>
             <w:proofErr w:type="spellStart"/>
@@ -9569,7 +9768,7 @@
                           <pic:cNvPicPr preferRelativeResize="0"/>
                         </pic:nvPicPr>
                         <pic:blipFill>
-                          <a:blip r:embed="rId7"/>
+                          <a:blip r:embed="rId8"/>
                           <a:srcRect/>
                           <a:stretch>
                             <a:fillRect/>
@@ -9700,7 +9899,7 @@
                           <pic:cNvPicPr preferRelativeResize="0"/>
                         </pic:nvPicPr>
                         <pic:blipFill>
-                          <a:blip r:embed="rId8"/>
+                          <a:blip r:embed="rId9"/>
                           <a:srcRect/>
                           <a:stretch>
                             <a:fillRect/>
@@ -9807,7 +10006,6 @@
                 <w:sz w:val="24"/>
                 <w:szCs w:val="24"/>
               </w:rPr>
-              <w:lastRenderedPageBreak/>
               <w:drawing>
                 <wp:inline distT="114300" distB="114300" distL="114300" distR="114300" wp14:anchorId="4819B358" wp14:editId="1D022018">
                   <wp:extent cx="5902462" cy="2772110"/>
@@ -9822,7 +10020,7 @@
                           <pic:cNvPicPr preferRelativeResize="0"/>
                         </pic:nvPicPr>
                         <pic:blipFill>
-                          <a:blip r:embed="rId9"/>
+                          <a:blip r:embed="rId10"/>
                           <a:srcRect r="-6191" b="-6191"/>
                           <a:stretch>
                             <a:fillRect/>
@@ -9940,172 +10138,6 @@
                       <pic:pic xmlns:pic="http://schemas.openxmlformats.org/drawingml/2006/picture">
                         <pic:nvPicPr>
                           <pic:cNvPr id="0" name="image14.png"/>
-                          <pic:cNvPicPr preferRelativeResize="0"/>
-                        </pic:nvPicPr>
-                        <pic:blipFill>
-                          <a:blip r:embed="rId10"/>
-                          <a:srcRect/>
-                          <a:stretch>
-                            <a:fillRect/>
-                          </a:stretch>
-                        </pic:blipFill>
-                        <pic:spPr>
-                          <a:xfrm>
-                            <a:off x="0" y="0"/>
-                            <a:ext cx="5591175" cy="2628900"/>
-                          </a:xfrm>
-                          <a:prstGeom prst="rect">
-                            <a:avLst/>
-                          </a:prstGeom>
-                          <a:ln/>
-                        </pic:spPr>
-                      </pic:pic>
-                    </a:graphicData>
-                  </a:graphic>
-                </wp:inline>
-              </w:drawing>
-            </w:r>
-          </w:p>
-          <w:p>
-            <w:pPr>
-              <w:spacing w:before="240" w:after="100" w:line="360" w:lineRule="auto"/>
-              <w:jc w:val="center"/>
-              <w:rPr>
-                <w:rFonts w:ascii="Times New Roman" w:eastAsia="Times New Roman" w:hAnsi="Times New Roman" w:cs="Times New Roman"/>
-                <w:b/>
-                <w:bCs/>
-                <w:sz w:val="24"/>
-                <w:szCs w:val="24"/>
-              </w:rPr>
-            </w:pPr>
-          </w:p>
-          <w:p>
-            <w:pPr>
-              <w:spacing w:before="240" w:after="100" w:line="360" w:lineRule="auto"/>
-              <w:jc w:val="center"/>
-              <w:rPr>
-                <w:rFonts w:ascii="Times New Roman" w:eastAsia="Times New Roman" w:hAnsi="Times New Roman" w:cs="Times New Roman"/>
-                <w:b/>
-                <w:bCs/>
-                <w:sz w:val="24"/>
-                <w:szCs w:val="24"/>
-              </w:rPr>
-            </w:pPr>
-          </w:p>
-          <w:p>
-            <w:pPr>
-              <w:spacing w:before="240" w:after="100" w:line="360" w:lineRule="auto"/>
-              <w:jc w:val="center"/>
-              <w:rPr>
-                <w:rFonts w:ascii="Times New Roman" w:eastAsia="Times New Roman" w:hAnsi="Times New Roman" w:cs="Times New Roman"/>
-                <w:b/>
-                <w:bCs/>
-                <w:sz w:val="24"/>
-                <w:szCs w:val="24"/>
-              </w:rPr>
-            </w:pPr>
-          </w:p>
-          <w:p>
-            <w:pPr>
-              <w:spacing w:before="240" w:after="100" w:line="360" w:lineRule="auto"/>
-              <w:rPr>
-                <w:rFonts w:ascii="Times New Roman" w:eastAsia="Times New Roman" w:hAnsi="Times New Roman" w:cs="Times New Roman"/>
-                <w:b/>
-                <w:bCs/>
-                <w:sz w:val="24"/>
-                <w:szCs w:val="24"/>
-              </w:rPr>
-            </w:pPr>
-          </w:p>
-        </w:tc>
-      </w:tr>
-      <w:tr>
-        <w:trPr>
-          <w:jc w:val="center"/>
-        </w:trPr>
-        <w:tc>
-          <w:tcPr>
-            <w:tcW w:w="9029" w:type="dxa"/>
-            <w:tcMar>
-              <w:top w:w="100" w:type="dxa"/>
-              <w:left w:w="100" w:type="dxa"/>
-              <w:bottom w:w="100" w:type="dxa"/>
-              <w:right w:w="100" w:type="dxa"/>
-            </w:tcMar>
-          </w:tcPr>
-          <w:p>
-            <w:pPr>
-              <w:widowControl w:val="0"/>
-              <w:spacing w:line="240" w:lineRule="auto"/>
-              <w:jc w:val="center"/>
-              <w:rPr>
-                <w:rFonts w:ascii="Times New Roman" w:eastAsia="Times New Roman" w:hAnsi="Times New Roman" w:cs="Times New Roman"/>
-                <w:b/>
-                <w:bCs/>
-                <w:sz w:val="28"/>
-                <w:szCs w:val="28"/>
-              </w:rPr>
-            </w:pPr>
-            <w:r>
-              <w:rPr>
-                <w:rFonts w:ascii="Times New Roman" w:eastAsia="Times New Roman" w:hAnsi="Times New Roman" w:cs="Times New Roman"/>
-                <w:b/>
-                <w:bCs/>
-                <w:sz w:val="28"/>
-                <w:szCs w:val="28"/>
-              </w:rPr>
-              <w:t>Detail Pesanan :</w:t>
-            </w:r>
-          </w:p>
-        </w:tc>
-      </w:tr>
-      <w:tr>
-        <w:trPr>
-          <w:jc w:val="center"/>
-        </w:trPr>
-        <w:tc>
-          <w:tcPr>
-            <w:tcW w:w="9029" w:type="dxa"/>
-            <w:tcMar>
-              <w:top w:w="100" w:type="dxa"/>
-              <w:left w:w="100" w:type="dxa"/>
-              <w:bottom w:w="100" w:type="dxa"/>
-              <w:right w:w="100" w:type="dxa"/>
-            </w:tcMar>
-          </w:tcPr>
-          <w:p>
-            <w:pPr>
-              <w:spacing w:before="240" w:after="100" w:line="360" w:lineRule="auto"/>
-              <w:jc w:val="center"/>
-              <w:rPr>
-                <w:rFonts w:ascii="Times New Roman" w:eastAsia="Times New Roman" w:hAnsi="Times New Roman" w:cs="Times New Roman"/>
-                <w:b/>
-                <w:bCs/>
-                <w:sz w:val="28"/>
-                <w:szCs w:val="28"/>
-              </w:rPr>
-            </w:pPr>
-            <w:r>
-              <w:rPr>
-                <w:rFonts w:ascii="Times New Roman" w:eastAsia="Times New Roman" w:hAnsi="Times New Roman" w:cs="Times New Roman"/>
-                <w:b/>
-                <w:bCs/>
-                <w:noProof/>
-                <w:sz w:val="24"/>
-                <w:szCs w:val="24"/>
-              </w:rPr>
-              <w:lastRenderedPageBreak/>
-              <w:drawing>
-                <wp:inline distT="114300" distB="114300" distL="114300" distR="114300" wp14:anchorId="33C63115" wp14:editId="5555CFD7">
-                  <wp:extent cx="5591175" cy="2628900"/>
-                  <wp:effectExtent l="0" t="0" r="0" b="0"/>
-                  <wp:docPr id="6" name="image11.png"/>
-                  <wp:cNvGraphicFramePr/>
-                  <a:graphic xmlns:a="http://schemas.openxmlformats.org/drawingml/2006/main">
-                    <a:graphicData uri="http://schemas.openxmlformats.org/drawingml/2006/picture">
-                      <pic:pic xmlns:pic="http://schemas.openxmlformats.org/drawingml/2006/picture">
-                        <pic:nvPicPr>
-                          <pic:cNvPr id="0" name="image11.png"/>
                           <pic:cNvPicPr preferRelativeResize="0"/>
                         </pic:nvPicPr>
                         <pic:blipFill>
@@ -10132,6 +10164,171 @@
               </w:drawing>
             </w:r>
           </w:p>
+          <w:p>
+            <w:pPr>
+              <w:spacing w:before="240" w:after="100" w:line="360" w:lineRule="auto"/>
+              <w:jc w:val="center"/>
+              <w:rPr>
+                <w:rFonts w:ascii="Times New Roman" w:eastAsia="Times New Roman" w:hAnsi="Times New Roman" w:cs="Times New Roman"/>
+                <w:b/>
+                <w:bCs/>
+                <w:sz w:val="24"/>
+                <w:szCs w:val="24"/>
+              </w:rPr>
+            </w:pPr>
+          </w:p>
+          <w:p>
+            <w:pPr>
+              <w:spacing w:before="240" w:after="100" w:line="360" w:lineRule="auto"/>
+              <w:jc w:val="center"/>
+              <w:rPr>
+                <w:rFonts w:ascii="Times New Roman" w:eastAsia="Times New Roman" w:hAnsi="Times New Roman" w:cs="Times New Roman"/>
+                <w:b/>
+                <w:bCs/>
+                <w:sz w:val="24"/>
+                <w:szCs w:val="24"/>
+              </w:rPr>
+            </w:pPr>
+          </w:p>
+          <w:p>
+            <w:pPr>
+              <w:spacing w:before="240" w:after="100" w:line="360" w:lineRule="auto"/>
+              <w:jc w:val="center"/>
+              <w:rPr>
+                <w:rFonts w:ascii="Times New Roman" w:eastAsia="Times New Roman" w:hAnsi="Times New Roman" w:cs="Times New Roman"/>
+                <w:b/>
+                <w:bCs/>
+                <w:sz w:val="24"/>
+                <w:szCs w:val="24"/>
+              </w:rPr>
+            </w:pPr>
+          </w:p>
+          <w:p>
+            <w:pPr>
+              <w:spacing w:before="240" w:after="100" w:line="360" w:lineRule="auto"/>
+              <w:rPr>
+                <w:rFonts w:ascii="Times New Roman" w:eastAsia="Times New Roman" w:hAnsi="Times New Roman" w:cs="Times New Roman"/>
+                <w:b/>
+                <w:bCs/>
+                <w:sz w:val="24"/>
+                <w:szCs w:val="24"/>
+              </w:rPr>
+            </w:pPr>
+          </w:p>
+        </w:tc>
+      </w:tr>
+      <w:tr>
+        <w:trPr>
+          <w:jc w:val="center"/>
+        </w:trPr>
+        <w:tc>
+          <w:tcPr>
+            <w:tcW w:w="9029" w:type="dxa"/>
+            <w:tcMar>
+              <w:top w:w="100" w:type="dxa"/>
+              <w:left w:w="100" w:type="dxa"/>
+              <w:bottom w:w="100" w:type="dxa"/>
+              <w:right w:w="100" w:type="dxa"/>
+            </w:tcMar>
+          </w:tcPr>
+          <w:p>
+            <w:pPr>
+              <w:widowControl w:val="0"/>
+              <w:spacing w:line="240" w:lineRule="auto"/>
+              <w:jc w:val="center"/>
+              <w:rPr>
+                <w:rFonts w:ascii="Times New Roman" w:eastAsia="Times New Roman" w:hAnsi="Times New Roman" w:cs="Times New Roman"/>
+                <w:b/>
+                <w:bCs/>
+                <w:sz w:val="28"/>
+                <w:szCs w:val="28"/>
+              </w:rPr>
+            </w:pPr>
+            <w:r>
+              <w:rPr>
+                <w:rFonts w:ascii="Times New Roman" w:eastAsia="Times New Roman" w:hAnsi="Times New Roman" w:cs="Times New Roman"/>
+                <w:b/>
+                <w:bCs/>
+                <w:sz w:val="28"/>
+                <w:szCs w:val="28"/>
+              </w:rPr>
+              <w:t>Detail Pesanan :</w:t>
+            </w:r>
+          </w:p>
+        </w:tc>
+      </w:tr>
+      <w:tr>
+        <w:trPr>
+          <w:jc w:val="center"/>
+        </w:trPr>
+        <w:tc>
+          <w:tcPr>
+            <w:tcW w:w="9029" w:type="dxa"/>
+            <w:tcMar>
+              <w:top w:w="100" w:type="dxa"/>
+              <w:left w:w="100" w:type="dxa"/>
+              <w:bottom w:w="100" w:type="dxa"/>
+              <w:right w:w="100" w:type="dxa"/>
+            </w:tcMar>
+          </w:tcPr>
+          <w:p>
+            <w:pPr>
+              <w:spacing w:before="240" w:after="100" w:line="360" w:lineRule="auto"/>
+              <w:jc w:val="center"/>
+              <w:rPr>
+                <w:rFonts w:ascii="Times New Roman" w:eastAsia="Times New Roman" w:hAnsi="Times New Roman" w:cs="Times New Roman"/>
+                <w:b/>
+                <w:bCs/>
+                <w:sz w:val="28"/>
+                <w:szCs w:val="28"/>
+              </w:rPr>
+            </w:pPr>
+            <w:r>
+              <w:rPr>
+                <w:rFonts w:ascii="Times New Roman" w:eastAsia="Times New Roman" w:hAnsi="Times New Roman" w:cs="Times New Roman"/>
+                <w:b/>
+                <w:bCs/>
+                <w:noProof/>
+                <w:sz w:val="24"/>
+                <w:szCs w:val="24"/>
+              </w:rPr>
+              <w:drawing>
+                <wp:inline distT="114300" distB="114300" distL="114300" distR="114300" wp14:anchorId="33C63115" wp14:editId="5555CFD7">
+                  <wp:extent cx="5591175" cy="2628900"/>
+                  <wp:effectExtent l="0" t="0" r="0" b="0"/>
+                  <wp:docPr id="6" name="image11.png"/>
+                  <wp:cNvGraphicFramePr/>
+                  <a:graphic xmlns:a="http://schemas.openxmlformats.org/drawingml/2006/main">
+                    <a:graphicData uri="http://schemas.openxmlformats.org/drawingml/2006/picture">
+                      <pic:pic xmlns:pic="http://schemas.openxmlformats.org/drawingml/2006/picture">
+                        <pic:nvPicPr>
+                          <pic:cNvPr id="0" name="image11.png"/>
+                          <pic:cNvPicPr preferRelativeResize="0"/>
+                        </pic:nvPicPr>
+                        <pic:blipFill>
+                          <a:blip r:embed="rId12"/>
+                          <a:srcRect/>
+                          <a:stretch>
+                            <a:fillRect/>
+                          </a:stretch>
+                        </pic:blipFill>
+                        <pic:spPr>
+                          <a:xfrm>
+                            <a:off x="0" y="0"/>
+                            <a:ext cx="5591175" cy="2628900"/>
+                          </a:xfrm>
+                          <a:prstGeom prst="rect">
+                            <a:avLst/>
+                          </a:prstGeom>
+                          <a:ln/>
+                        </pic:spPr>
+                      </pic:pic>
+                    </a:graphicData>
+                  </a:graphic>
+                </wp:inline>
+              </w:drawing>
+            </w:r>
+          </w:p>
         </w:tc>
       </w:tr>
       <w:tr>
@@ -10222,7 +10419,7 @@
                           <pic:cNvPicPr preferRelativeResize="0"/>
                         </pic:nvPicPr>
                         <pic:blipFill>
-                          <a:blip r:embed="rId12"/>
+                          <a:blip r:embed="rId13"/>
                           <a:srcRect/>
                           <a:stretch>
                             <a:fillRect/>
@@ -10360,7 +10557,6 @@
                 <w:sz w:val="24"/>
                 <w:szCs w:val="24"/>
               </w:rPr>
-              <w:lastRenderedPageBreak/>
               <w:drawing>
                 <wp:inline distT="114300" distB="114300" distL="114300" distR="114300" wp14:anchorId="43EA1312" wp14:editId="05EA605A">
                   <wp:extent cx="5591175" cy="2628900"/>
@@ -10375,7 +10571,7 @@
                           <pic:cNvPicPr preferRelativeResize="0"/>
                         </pic:nvPicPr>
                         <pic:blipFill>
-                          <a:blip r:embed="rId13"/>
+                          <a:blip r:embed="rId14"/>
                           <a:srcRect/>
                           <a:stretch>
                             <a:fillRect/>
@@ -10516,7 +10712,7 @@
                     <pic:cNvPicPr preferRelativeResize="0"/>
                   </pic:nvPicPr>
                   <pic:blipFill>
-                    <a:blip r:embed="rId13"/>
+                    <a:blip r:embed="rId14"/>
                     <a:srcRect/>
                     <a:stretch>
                       <a:fillRect/>
@@ -10902,7 +11098,6 @@
                 <w:sz w:val="24"/>
                 <w:szCs w:val="24"/>
               </w:rPr>
-              <w:lastRenderedPageBreak/>
               <w:drawing>
                 <wp:inline distT="114300" distB="114300" distL="114300" distR="114300" wp14:anchorId="7D20B0FD" wp14:editId="6A32D829">
                   <wp:extent cx="1662113" cy="2947898"/>
@@ -10917,7 +11112,7 @@
                           <pic:cNvPicPr preferRelativeResize="0"/>
                         </pic:nvPicPr>
                         <pic:blipFill>
-                          <a:blip r:embed="rId14"/>
+                          <a:blip r:embed="rId15"/>
                           <a:srcRect/>
                           <a:stretch>
                             <a:fillRect/>
@@ -10986,7 +11181,7 @@
                           <pic:cNvPicPr preferRelativeResize="0"/>
                         </pic:nvPicPr>
                         <pic:blipFill>
-                          <a:blip r:embed="rId15"/>
+                          <a:blip r:embed="rId16"/>
                           <a:srcRect/>
                           <a:stretch>
                             <a:fillRect/>
@@ -11147,7 +11342,7 @@
                           <pic:cNvPicPr preferRelativeResize="0"/>
                         </pic:nvPicPr>
                         <pic:blipFill>
-                          <a:blip r:embed="rId16"/>
+                          <a:blip r:embed="rId17"/>
                           <a:srcRect/>
                           <a:stretch>
                             <a:fillRect/>
@@ -11214,7 +11409,7 @@
                           <pic:cNvPicPr preferRelativeResize="0"/>
                         </pic:nvPicPr>
                         <pic:blipFill>
-                          <a:blip r:embed="rId17"/>
+                          <a:blip r:embed="rId18"/>
                           <a:srcRect/>
                           <a:stretch>
                             <a:fillRect/>
@@ -11280,7 +11475,6 @@
           <w:sz w:val="24"/>
           <w:szCs w:val="24"/>
         </w:rPr>
-        <w:lastRenderedPageBreak/>
         <w:drawing>
           <wp:inline distT="114300" distB="114300" distL="114300" distR="114300" wp14:anchorId="506834F0" wp14:editId="48C3BED8">
             <wp:extent cx="2109611" cy="4060534"/>
@@ -11295,7 +11489,7 @@
                     <pic:cNvPicPr preferRelativeResize="0"/>
                   </pic:nvPicPr>
                   <pic:blipFill>
-                    <a:blip r:embed="rId18"/>
+                    <a:blip r:embed="rId19"/>
                     <a:srcRect/>
                     <a:stretch>
                       <a:fillRect/>
@@ -11493,7 +11687,6 @@
                 <w:sz w:val="24"/>
                 <w:szCs w:val="24"/>
               </w:rPr>
-              <w:lastRenderedPageBreak/>
               <w:t xml:space="preserve">Server / </w:t>
             </w:r>
             <w:proofErr w:type="spellStart"/>
@@ -13656,12 +13849,11 @@
       <w:bookmarkStart w:id="23" w:name="_crmjfuesykvd" w:colFirst="0" w:colLast="0"/>
       <w:bookmarkEnd w:id="23"/>
       <w:r>
-        <w:lastRenderedPageBreak/>
         <w:t>BAB IV - FITUR DAN PERSYARATAN FUNGSIONAL</w:t>
       </w:r>
       <w:r>
         <w:pict w14:anchorId="187D2E47">
-          <v:rect id="_x0000_i1029" style="width:0;height:1.5pt" o:hralign="center" o:hrstd="t" o:hr="t" fillcolor="#a0a0a0" stroked="f"/>
+          <v:rect id="_x0000_i1249" style="width:0;height:1.5pt" o:hralign="center" o:hrstd="t" o:hr="t" fillcolor="#a0a0a0" stroked="f"/>
         </w:pict>
       </w:r>
       <w:r>
@@ -14851,16 +15043,7 @@
                 <w:sz w:val="24"/>
                 <w:szCs w:val="24"/>
               </w:rPr>
-              <w:t xml:space="preserve"> menggunakan formula: Total PO = Σ (harga jual produk × jumlah pesanan). Harga jual yang </w:t>
-            </w:r>
-            <w:r>
-              <w:rPr>
-                <w:rFonts w:ascii="Times New Roman" w:eastAsia="Times New Roman" w:hAnsi="Times New Roman" w:cs="Times New Roman"/>
-                <w:sz w:val="24"/>
-                <w:szCs w:val="24"/>
-              </w:rPr>
-              <w:lastRenderedPageBreak/>
-              <w:t>digunakan dikunci berdasarkan data HPP pada saat PO dibuat.</w:t>
+              <w:t xml:space="preserve"> menggunakan formula: Total PO = Σ (harga jual produk × jumlah pesanan). Harga jual yang digunakan dikunci berdasarkan data HPP pada saat PO dibuat.</w:t>
             </w:r>
           </w:p>
         </w:tc>
@@ -14895,7 +15078,6 @@
                 <w:sz w:val="24"/>
                 <w:szCs w:val="24"/>
               </w:rPr>
-              <w:lastRenderedPageBreak/>
               <w:t>Tinggi</w:t>
             </w:r>
           </w:p>
@@ -15373,7 +15555,6 @@
           <w:sz w:val="24"/>
           <w:szCs w:val="24"/>
         </w:rPr>
-        <w:lastRenderedPageBreak/>
         <w:t>→  Jika semua bahan baku mencukupi → sistem menampilkan indikator hijau 'Stok Tersedia' dan mengizinkan PO dikonfirmasi</w:t>
       </w:r>
     </w:p>
@@ -16014,7 +16195,6 @@
                 <w:sz w:val="24"/>
                 <w:szCs w:val="24"/>
               </w:rPr>
-              <w:lastRenderedPageBreak/>
               <w:t>REQ-PO-011</w:t>
             </w:r>
           </w:p>
@@ -18431,7 +18611,6 @@
           <w:sz w:val="24"/>
           <w:szCs w:val="24"/>
         </w:rPr>
-        <w:lastRenderedPageBreak/>
         <w:t xml:space="preserve"> </w:t>
       </w:r>
     </w:p>
@@ -19200,7 +19379,6 @@
                 <w:sz w:val="24"/>
                 <w:szCs w:val="24"/>
               </w:rPr>
-              <w:lastRenderedPageBreak/>
               <w:t>REQ-PO-017</w:t>
             </w:r>
           </w:p>
@@ -19960,7 +20138,6 @@
                 <w:sz w:val="24"/>
                 <w:szCs w:val="24"/>
               </w:rPr>
-              <w:lastRenderedPageBreak/>
               <w:t>1</w:t>
             </w:r>
           </w:p>
@@ -20971,7 +21148,6 @@
                 <w:sz w:val="24"/>
                 <w:szCs w:val="24"/>
               </w:rPr>
-              <w:lastRenderedPageBreak/>
               <w:t>Kode</w:t>
             </w:r>
           </w:p>
@@ -21846,7 +22022,6 @@
                 <w:sz w:val="24"/>
                 <w:szCs w:val="24"/>
               </w:rPr>
-              <w:lastRenderedPageBreak/>
               <w:t>REQ-PO-023</w:t>
             </w:r>
           </w:p>
@@ -22460,7 +22635,7 @@
       </w:r>
       <w:r>
         <w:pict w14:anchorId="15650A0D">
-          <v:rect id="_x0000_i1030" style="width:0;height:1.5pt" o:hralign="center" o:hrstd="t" o:hr="t" fillcolor="#a0a0a0" stroked="f"/>
+          <v:rect id="_x0000_i1250" style="width:0;height:1.5pt" o:hralign="center" o:hrstd="t" o:hr="t" fillcolor="#a0a0a0" stroked="f"/>
         </w:pict>
       </w:r>
       <w:r>
@@ -23194,7 +23369,6 @@
           <w:sz w:val="24"/>
           <w:szCs w:val="24"/>
         </w:rPr>
-        <w:lastRenderedPageBreak/>
         <w:t xml:space="preserve">•     REQ-NFR-PO-007: Link berbagi PDF menggunakan </w:t>
       </w:r>
       <w:proofErr w:type="spellStart"/>
@@ -23521,7 +23695,7 @@
       </w:r>
       <w:r>
         <w:pict w14:anchorId="603F474C">
-          <v:rect id="_x0000_i1031" style="width:0;height:1.5pt" o:hralign="center" o:hrstd="t" o:hr="t" fillcolor="#a0a0a0" stroked="f"/>
+          <v:rect id="_x0000_i1251" style="width:0;height:1.5pt" o:hralign="center" o:hrstd="t" o:hr="t" fillcolor="#a0a0a0" stroked="f"/>
         </w:pict>
       </w:r>
       <w:r>
@@ -25260,6 +25434,1956 @@
     </w:p>
     <w:p>
       <w:pPr>
+        <w:spacing w:after="80" w:line="360" w:lineRule="auto"/>
+        <w:ind w:left="720" w:hanging="240"/>
+        <w:rPr>
+          <w:rFonts w:ascii="Times New Roman" w:eastAsia="Times New Roman" w:hAnsi="Times New Roman" w:cs="Times New Roman"/>
+          <w:sz w:val="24"/>
+          <w:szCs w:val="24"/>
+        </w:rPr>
+      </w:pPr>
+    </w:p>
+    <w:p>
+      <w:pPr>
+        <w:spacing w:after="80" w:line="360" w:lineRule="auto"/>
+        <w:ind w:left="720" w:hanging="240"/>
+        <w:rPr>
+          <w:rFonts w:ascii="Times New Roman" w:eastAsia="Times New Roman" w:hAnsi="Times New Roman" w:cs="Times New Roman"/>
+          <w:sz w:val="24"/>
+          <w:szCs w:val="24"/>
+        </w:rPr>
+      </w:pPr>
+    </w:p>
+    <w:p>
+      <w:pPr>
+        <w:spacing w:after="80" w:line="360" w:lineRule="auto"/>
+        <w:ind w:left="720" w:hanging="240"/>
+        <w:rPr>
+          <w:rFonts w:ascii="Times New Roman" w:eastAsia="Times New Roman" w:hAnsi="Times New Roman" w:cs="Times New Roman"/>
+          <w:sz w:val="24"/>
+          <w:szCs w:val="24"/>
+        </w:rPr>
+      </w:pPr>
+    </w:p>
+    <w:p>
+      <w:pPr>
+        <w:spacing w:after="80" w:line="360" w:lineRule="auto"/>
+        <w:ind w:left="720" w:hanging="240"/>
+        <w:rPr>
+          <w:rFonts w:ascii="Times New Roman" w:eastAsia="Times New Roman" w:hAnsi="Times New Roman" w:cs="Times New Roman"/>
+          <w:sz w:val="24"/>
+          <w:szCs w:val="24"/>
+        </w:rPr>
+      </w:pPr>
+    </w:p>
+    <w:p>
+      <w:pPr>
+        <w:spacing w:after="80" w:line="360" w:lineRule="auto"/>
+        <w:ind w:left="720" w:hanging="240"/>
+        <w:rPr>
+          <w:rFonts w:ascii="Times New Roman" w:eastAsia="Times New Roman" w:hAnsi="Times New Roman" w:cs="Times New Roman"/>
+          <w:sz w:val="24"/>
+          <w:szCs w:val="24"/>
+        </w:rPr>
+      </w:pPr>
+    </w:p>
+    <w:p>
+      <w:pPr>
+        <w:spacing w:after="80" w:line="360" w:lineRule="auto"/>
+        <w:ind w:left="720" w:hanging="240"/>
+        <w:rPr>
+          <w:rFonts w:ascii="Times New Roman" w:eastAsia="Times New Roman" w:hAnsi="Times New Roman" w:cs="Times New Roman"/>
+          <w:sz w:val="24"/>
+          <w:szCs w:val="24"/>
+        </w:rPr>
+      </w:pPr>
+    </w:p>
+    <w:p>
+      <w:pPr>
+        <w:pStyle w:val="Judul1"/>
+        <w:rPr>
+          <w:lang w:val="sv-SE"/>
+        </w:rPr>
+      </w:pPr>
+      <w:r>
+        <w:rPr>
+          <w:lang w:val="sv-SE"/>
+        </w:rPr>
+        <w:t>BAB VII – MANAJEMEN PROYEK DAN PEMBAGIAN TUGAS TIM</w:t>
+      </w:r>
+    </w:p>
+    <w:p>
+      <w:pPr>
+        <w:pStyle w:val="Judul2"/>
+        <w:rPr>
+          <w:lang w:val="sv-SE"/>
+        </w:rPr>
+      </w:pPr>
+      <w:r>
+        <w:rPr>
+          <w:lang w:val="sv-SE"/>
+        </w:rPr>
+        <w:t>7.1 Struktur Tim Proyek</w:t>
+      </w:r>
+    </w:p>
+    <w:p>
+      <w:pPr>
+        <w:spacing w:after="80" w:line="360" w:lineRule="auto"/>
+        <w:ind w:left="720" w:firstLine="414"/>
+        <w:rPr>
+          <w:rFonts w:ascii="Times New Roman" w:eastAsia="Times New Roman" w:hAnsi="Times New Roman" w:cs="Times New Roman"/>
+          <w:sz w:val="24"/>
+          <w:szCs w:val="24"/>
+          <w:lang w:val="sv-SE"/>
+        </w:rPr>
+      </w:pPr>
+      <w:r>
+        <w:rPr>
+          <w:rFonts w:ascii="Times New Roman" w:eastAsia="Times New Roman" w:hAnsi="Times New Roman" w:cs="Times New Roman"/>
+          <w:sz w:val="24"/>
+          <w:szCs w:val="24"/>
+          <w:lang w:val="sv-SE"/>
+        </w:rPr>
+        <w:t>Tim pengembangan sistem terdiri dari beberapa anggota yang memiliki peran dan tanggung jawab masing-masing dalam proses analisis, perancangan, pengembangan, dokumentasi, hingga pengujian sistem. Pembagian tugas dilakukan agar proses pengembangan berjalan secara efektif, terstruktur, dan sesuai dengan target yang telah ditentukan.</w:t>
+      </w:r>
+    </w:p>
+    <w:p>
+      <w:pPr>
+        <w:pStyle w:val="Judul2"/>
+        <w:rPr>
+          <w:lang w:val="sv-SE"/>
+        </w:rPr>
+      </w:pPr>
+      <w:r>
+        <w:rPr>
+          <w:lang w:val="sv-SE"/>
+        </w:rPr>
+        <w:t>7.</w:t>
+      </w:r>
+      <w:r>
+        <w:rPr>
+          <w:lang w:val="sv-SE"/>
+        </w:rPr>
+        <w:t>2</w:t>
+      </w:r>
+      <w:r>
+        <w:rPr>
+          <w:lang w:val="sv-SE"/>
+        </w:rPr>
+        <w:t xml:space="preserve"> </w:t>
+      </w:r>
+      <w:r>
+        <w:rPr>
+          <w:lang w:val="sv-SE"/>
+        </w:rPr>
+        <w:t>Pembagian Tugas dan Tanggung Jawab</w:t>
+      </w:r>
+    </w:p>
+    <w:tbl>
+      <w:tblPr>
+        <w:tblW w:w="0" w:type="auto"/>
+        <w:tblCellSpacing w:w="15" w:type="dxa"/>
+        <w:tblBorders>
+          <w:top w:val="single" w:sz="4" w:space="0" w:color="auto"/>
+          <w:left w:val="single" w:sz="4" w:space="0" w:color="auto"/>
+          <w:bottom w:val="single" w:sz="4" w:space="0" w:color="auto"/>
+          <w:right w:val="single" w:sz="4" w:space="0" w:color="auto"/>
+          <w:insideH w:val="single" w:sz="4" w:space="0" w:color="auto"/>
+          <w:insideV w:val="single" w:sz="4" w:space="0" w:color="auto"/>
+        </w:tblBorders>
+        <w:tblLayout w:type="fixed"/>
+        <w:tblCellMar>
+          <w:top w:w="15" w:type="dxa"/>
+          <w:left w:w="15" w:type="dxa"/>
+          <w:bottom w:w="15" w:type="dxa"/>
+          <w:right w:w="15" w:type="dxa"/>
+        </w:tblCellMar>
+        <w:tblLook w:val="04A0" w:firstRow="1" w:lastRow="0" w:firstColumn="1" w:lastColumn="0" w:noHBand="0" w:noVBand="1"/>
+      </w:tblPr>
+      <w:tblGrid>
+        <w:gridCol w:w="1129"/>
+        <w:gridCol w:w="1459"/>
+        <w:gridCol w:w="1803"/>
+        <w:gridCol w:w="1764"/>
+        <w:gridCol w:w="2864"/>
+      </w:tblGrid>
+      <w:tr>
+        <w:trPr>
+          <w:tblHeader/>
+          <w:tblCellSpacing w:w="15" w:type="dxa"/>
+        </w:trPr>
+        <w:tc>
+          <w:tcPr>
+            <w:tcW w:w="1084" w:type="dxa"/>
+            <w:shd w:val="clear" w:color="auto" w:fill="auto"/>
+            <w:vAlign w:val="center"/>
+            <w:hideMark/>
+          </w:tcPr>
+          <w:p>
+            <w:pPr>
+              <w:spacing w:after="80" w:line="360" w:lineRule="auto"/>
+              <w:ind w:left="720" w:hanging="240"/>
+              <w:rPr>
+                <w:rFonts w:ascii="Times New Roman" w:eastAsia="Times New Roman" w:hAnsi="Times New Roman" w:cs="Times New Roman"/>
+                <w:sz w:val="24"/>
+                <w:szCs w:val="24"/>
+                <w:lang w:val="en-ID"/>
+              </w:rPr>
+            </w:pPr>
+            <w:r>
+              <w:rPr>
+                <w:rFonts w:ascii="Times New Roman" w:eastAsia="Times New Roman" w:hAnsi="Times New Roman" w:cs="Times New Roman"/>
+                <w:sz w:val="24"/>
+                <w:szCs w:val="24"/>
+                <w:lang w:val="en-ID"/>
+              </w:rPr>
+              <w:t>No</w:t>
+            </w:r>
+          </w:p>
+        </w:tc>
+        <w:tc>
+          <w:tcPr>
+            <w:tcW w:w="1429" w:type="dxa"/>
+            <w:shd w:val="clear" w:color="auto" w:fill="auto"/>
+            <w:vAlign w:val="center"/>
+            <w:hideMark/>
+          </w:tcPr>
+          <w:p>
+            <w:pPr>
+              <w:spacing w:after="80" w:line="360" w:lineRule="auto"/>
+              <w:ind w:left="720" w:hanging="240"/>
+              <w:rPr>
+                <w:rFonts w:ascii="Times New Roman" w:eastAsia="Times New Roman" w:hAnsi="Times New Roman" w:cs="Times New Roman"/>
+                <w:sz w:val="24"/>
+                <w:szCs w:val="24"/>
+                <w:lang w:val="en-ID"/>
+              </w:rPr>
+            </w:pPr>
+            <w:r>
+              <w:rPr>
+                <w:rFonts w:ascii="Times New Roman" w:eastAsia="Times New Roman" w:hAnsi="Times New Roman" w:cs="Times New Roman"/>
+                <w:sz w:val="24"/>
+                <w:szCs w:val="24"/>
+                <w:lang w:val="en-ID"/>
+              </w:rPr>
+              <w:t>Nama</w:t>
+            </w:r>
+          </w:p>
+        </w:tc>
+        <w:tc>
+          <w:tcPr>
+            <w:tcW w:w="1773" w:type="dxa"/>
+            <w:shd w:val="clear" w:color="auto" w:fill="auto"/>
+            <w:vAlign w:val="center"/>
+            <w:hideMark/>
+          </w:tcPr>
+          <w:p>
+            <w:pPr>
+              <w:spacing w:after="80" w:line="360" w:lineRule="auto"/>
+              <w:ind w:left="720" w:hanging="240"/>
+              <w:rPr>
+                <w:rFonts w:ascii="Times New Roman" w:eastAsia="Times New Roman" w:hAnsi="Times New Roman" w:cs="Times New Roman"/>
+                <w:sz w:val="24"/>
+                <w:szCs w:val="24"/>
+                <w:lang w:val="en-ID"/>
+              </w:rPr>
+            </w:pPr>
+            <w:r>
+              <w:rPr>
+                <w:rFonts w:ascii="Times New Roman" w:eastAsia="Times New Roman" w:hAnsi="Times New Roman" w:cs="Times New Roman"/>
+                <w:sz w:val="24"/>
+                <w:szCs w:val="24"/>
+                <w:lang w:val="en-ID"/>
+              </w:rPr>
+              <w:t>NIM</w:t>
+            </w:r>
+          </w:p>
+        </w:tc>
+        <w:tc>
+          <w:tcPr>
+            <w:tcW w:w="1734" w:type="dxa"/>
+            <w:shd w:val="clear" w:color="auto" w:fill="auto"/>
+            <w:vAlign w:val="center"/>
+            <w:hideMark/>
+          </w:tcPr>
+          <w:p>
+            <w:pPr>
+              <w:spacing w:after="80" w:line="360" w:lineRule="auto"/>
+              <w:ind w:left="720" w:hanging="240"/>
+              <w:jc w:val="center"/>
+              <w:rPr>
+                <w:rFonts w:ascii="Times New Roman" w:eastAsia="Times New Roman" w:hAnsi="Times New Roman" w:cs="Times New Roman"/>
+                <w:sz w:val="24"/>
+                <w:szCs w:val="24"/>
+                <w:lang w:val="en-ID"/>
+              </w:rPr>
+            </w:pPr>
+            <w:proofErr w:type="spellStart"/>
+            <w:r>
+              <w:rPr>
+                <w:rFonts w:ascii="Times New Roman" w:eastAsia="Times New Roman" w:hAnsi="Times New Roman" w:cs="Times New Roman"/>
+                <w:sz w:val="24"/>
+                <w:szCs w:val="24"/>
+                <w:lang w:val="en-ID"/>
+              </w:rPr>
+              <w:t>Jabatan</w:t>
+            </w:r>
+            <w:proofErr w:type="spellEnd"/>
+            <w:r>
+              <w:rPr>
+                <w:rFonts w:ascii="Times New Roman" w:eastAsia="Times New Roman" w:hAnsi="Times New Roman" w:cs="Times New Roman"/>
+                <w:sz w:val="24"/>
+                <w:szCs w:val="24"/>
+                <w:lang w:val="en-ID"/>
+              </w:rPr>
+              <w:t xml:space="preserve"> / Peran</w:t>
+            </w:r>
+          </w:p>
+        </w:tc>
+        <w:tc>
+          <w:tcPr>
+            <w:tcW w:w="2819" w:type="dxa"/>
+            <w:shd w:val="clear" w:color="auto" w:fill="auto"/>
+            <w:vAlign w:val="center"/>
+            <w:hideMark/>
+          </w:tcPr>
+          <w:p>
+            <w:pPr>
+              <w:spacing w:after="80" w:line="360" w:lineRule="auto"/>
+              <w:ind w:left="720" w:hanging="240"/>
+              <w:rPr>
+                <w:rFonts w:ascii="Times New Roman" w:eastAsia="Times New Roman" w:hAnsi="Times New Roman" w:cs="Times New Roman"/>
+                <w:sz w:val="24"/>
+                <w:szCs w:val="24"/>
+                <w:lang w:val="en-ID"/>
+              </w:rPr>
+            </w:pPr>
+            <w:proofErr w:type="spellStart"/>
+            <w:r>
+              <w:rPr>
+                <w:rFonts w:ascii="Times New Roman" w:eastAsia="Times New Roman" w:hAnsi="Times New Roman" w:cs="Times New Roman"/>
+                <w:sz w:val="24"/>
+                <w:szCs w:val="24"/>
+                <w:lang w:val="en-ID"/>
+              </w:rPr>
+              <w:t>Tanggung</w:t>
+            </w:r>
+            <w:proofErr w:type="spellEnd"/>
+            <w:r>
+              <w:rPr>
+                <w:rFonts w:ascii="Times New Roman" w:eastAsia="Times New Roman" w:hAnsi="Times New Roman" w:cs="Times New Roman"/>
+                <w:sz w:val="24"/>
+                <w:szCs w:val="24"/>
+                <w:lang w:val="en-ID"/>
+              </w:rPr>
+              <w:t xml:space="preserve"> Jawab</w:t>
+            </w:r>
+          </w:p>
+        </w:tc>
+      </w:tr>
+      <w:tr>
+        <w:trPr>
+          <w:tblCellSpacing w:w="15" w:type="dxa"/>
+        </w:trPr>
+        <w:tc>
+          <w:tcPr>
+            <w:tcW w:w="1084" w:type="dxa"/>
+            <w:shd w:val="clear" w:color="auto" w:fill="auto"/>
+            <w:vAlign w:val="center"/>
+            <w:hideMark/>
+          </w:tcPr>
+          <w:p>
+            <w:pPr>
+              <w:spacing w:after="80" w:line="360" w:lineRule="auto"/>
+              <w:ind w:left="720" w:hanging="240"/>
+              <w:rPr>
+                <w:rFonts w:ascii="Times New Roman" w:eastAsia="Times New Roman" w:hAnsi="Times New Roman" w:cs="Times New Roman"/>
+                <w:sz w:val="24"/>
+                <w:szCs w:val="24"/>
+                <w:lang w:val="en-ID"/>
+              </w:rPr>
+            </w:pPr>
+            <w:r>
+              <w:rPr>
+                <w:rFonts w:ascii="Times New Roman" w:eastAsia="Times New Roman" w:hAnsi="Times New Roman" w:cs="Times New Roman"/>
+                <w:sz w:val="24"/>
+                <w:szCs w:val="24"/>
+                <w:lang w:val="en-ID"/>
+              </w:rPr>
+              <w:t>1</w:t>
+            </w:r>
+          </w:p>
+        </w:tc>
+        <w:tc>
+          <w:tcPr>
+            <w:tcW w:w="1429" w:type="dxa"/>
+            <w:shd w:val="clear" w:color="auto" w:fill="auto"/>
+            <w:vAlign w:val="center"/>
+            <w:hideMark/>
+          </w:tcPr>
+          <w:p>
+            <w:pPr>
+              <w:spacing w:after="80" w:line="360" w:lineRule="auto"/>
+              <w:ind w:left="720" w:hanging="240"/>
+              <w:rPr>
+                <w:rFonts w:ascii="Times New Roman" w:eastAsia="Times New Roman" w:hAnsi="Times New Roman" w:cs="Times New Roman"/>
+                <w:sz w:val="24"/>
+                <w:szCs w:val="24"/>
+                <w:lang w:val="en-ID"/>
+              </w:rPr>
+            </w:pPr>
+            <w:r>
+              <w:rPr>
+                <w:rFonts w:ascii="Times New Roman" w:eastAsia="Times New Roman" w:hAnsi="Times New Roman" w:cs="Times New Roman"/>
+                <w:sz w:val="24"/>
+                <w:szCs w:val="24"/>
+                <w:lang w:val="en-ID"/>
+              </w:rPr>
+              <w:t>Nayla Rabia Gustari</w:t>
+            </w:r>
+          </w:p>
+        </w:tc>
+        <w:tc>
+          <w:tcPr>
+            <w:tcW w:w="1773" w:type="dxa"/>
+            <w:shd w:val="clear" w:color="auto" w:fill="auto"/>
+            <w:vAlign w:val="center"/>
+            <w:hideMark/>
+          </w:tcPr>
+          <w:p>
+            <w:pPr>
+              <w:spacing w:after="80" w:line="360" w:lineRule="auto"/>
+              <w:ind w:left="720" w:hanging="240"/>
+              <w:rPr>
+                <w:rFonts w:ascii="Times New Roman" w:eastAsia="Times New Roman" w:hAnsi="Times New Roman" w:cs="Times New Roman"/>
+                <w:sz w:val="24"/>
+                <w:szCs w:val="24"/>
+                <w:lang w:val="en-ID"/>
+              </w:rPr>
+            </w:pPr>
+            <w:r>
+              <w:rPr>
+                <w:rFonts w:ascii="Times New Roman" w:eastAsia="Times New Roman" w:hAnsi="Times New Roman" w:cs="Times New Roman"/>
+                <w:sz w:val="24"/>
+                <w:szCs w:val="24"/>
+                <w:lang w:val="en-ID"/>
+              </w:rPr>
+              <w:t>20241320034</w:t>
+            </w:r>
+          </w:p>
+        </w:tc>
+        <w:tc>
+          <w:tcPr>
+            <w:tcW w:w="1734" w:type="dxa"/>
+            <w:shd w:val="clear" w:color="auto" w:fill="auto"/>
+            <w:vAlign w:val="center"/>
+            <w:hideMark/>
+          </w:tcPr>
+          <w:p>
+            <w:pPr>
+              <w:spacing w:after="80" w:line="360" w:lineRule="auto"/>
+              <w:ind w:left="239"/>
+              <w:rPr>
+                <w:rFonts w:ascii="Times New Roman" w:eastAsia="Times New Roman" w:hAnsi="Times New Roman" w:cs="Times New Roman"/>
+                <w:sz w:val="24"/>
+                <w:szCs w:val="24"/>
+                <w:lang w:val="en-ID"/>
+              </w:rPr>
+            </w:pPr>
+            <w:r>
+              <w:rPr>
+                <w:rFonts w:ascii="Times New Roman" w:eastAsia="Times New Roman" w:hAnsi="Times New Roman" w:cs="Times New Roman"/>
+                <w:sz w:val="24"/>
+                <w:szCs w:val="24"/>
+                <w:lang w:val="en-ID"/>
+              </w:rPr>
+              <w:t>Project Manager (PM)</w:t>
+            </w:r>
+          </w:p>
+        </w:tc>
+        <w:tc>
+          <w:tcPr>
+            <w:tcW w:w="2819" w:type="dxa"/>
+            <w:shd w:val="clear" w:color="auto" w:fill="auto"/>
+            <w:vAlign w:val="center"/>
+            <w:hideMark/>
+          </w:tcPr>
+          <w:p>
+            <w:pPr>
+              <w:spacing w:after="80" w:line="360" w:lineRule="auto"/>
+              <w:ind w:left="183"/>
+              <w:rPr>
+                <w:rFonts w:ascii="Times New Roman" w:eastAsia="Times New Roman" w:hAnsi="Times New Roman" w:cs="Times New Roman"/>
+                <w:sz w:val="24"/>
+                <w:szCs w:val="24"/>
+                <w:lang w:val="sv-SE"/>
+              </w:rPr>
+            </w:pPr>
+            <w:r>
+              <w:rPr>
+                <w:rFonts w:ascii="Times New Roman" w:eastAsia="Times New Roman" w:hAnsi="Times New Roman" w:cs="Times New Roman"/>
+                <w:sz w:val="24"/>
+                <w:szCs w:val="24"/>
+                <w:lang w:val="sv-SE"/>
+              </w:rPr>
+              <w:t>Mengatur jalannya proyek, mengoordinasikan anggota tim, menyusun timeline pengerjaan, serta memastikan proyek berjalan sesuai target dan kebutuhan sistem.</w:t>
+            </w:r>
+          </w:p>
+        </w:tc>
+      </w:tr>
+      <w:tr>
+        <w:trPr>
+          <w:tblCellSpacing w:w="15" w:type="dxa"/>
+        </w:trPr>
+        <w:tc>
+          <w:tcPr>
+            <w:tcW w:w="1084" w:type="dxa"/>
+            <w:shd w:val="clear" w:color="auto" w:fill="auto"/>
+            <w:vAlign w:val="center"/>
+            <w:hideMark/>
+          </w:tcPr>
+          <w:p>
+            <w:pPr>
+              <w:spacing w:after="80" w:line="360" w:lineRule="auto"/>
+              <w:ind w:left="142"/>
+              <w:rPr>
+                <w:rFonts w:ascii="Times New Roman" w:eastAsia="Times New Roman" w:hAnsi="Times New Roman" w:cs="Times New Roman"/>
+                <w:sz w:val="24"/>
+                <w:szCs w:val="24"/>
+                <w:lang w:val="en-ID"/>
+              </w:rPr>
+            </w:pPr>
+            <w:r>
+              <w:rPr>
+                <w:rFonts w:ascii="Times New Roman" w:eastAsia="Times New Roman" w:hAnsi="Times New Roman" w:cs="Times New Roman"/>
+                <w:sz w:val="24"/>
+                <w:szCs w:val="24"/>
+                <w:lang w:val="en-ID"/>
+              </w:rPr>
+              <w:t>2</w:t>
+            </w:r>
+          </w:p>
+        </w:tc>
+        <w:tc>
+          <w:tcPr>
+            <w:tcW w:w="1429" w:type="dxa"/>
+            <w:shd w:val="clear" w:color="auto" w:fill="auto"/>
+            <w:vAlign w:val="center"/>
+            <w:hideMark/>
+          </w:tcPr>
+          <w:p>
+            <w:pPr>
+              <w:spacing w:after="80" w:line="360" w:lineRule="auto"/>
+              <w:ind w:left="142"/>
+              <w:rPr>
+                <w:rFonts w:ascii="Times New Roman" w:eastAsia="Times New Roman" w:hAnsi="Times New Roman" w:cs="Times New Roman"/>
+                <w:sz w:val="24"/>
+                <w:szCs w:val="24"/>
+                <w:lang w:val="en-ID"/>
+              </w:rPr>
+            </w:pPr>
+            <w:r>
+              <w:rPr>
+                <w:rFonts w:ascii="Times New Roman" w:eastAsia="Times New Roman" w:hAnsi="Times New Roman" w:cs="Times New Roman"/>
+                <w:sz w:val="24"/>
+                <w:szCs w:val="24"/>
+                <w:lang w:val="en-ID"/>
+              </w:rPr>
+              <w:t>Adrian Ronald Daga</w:t>
+            </w:r>
+          </w:p>
+        </w:tc>
+        <w:tc>
+          <w:tcPr>
+            <w:tcW w:w="1773" w:type="dxa"/>
+            <w:shd w:val="clear" w:color="auto" w:fill="auto"/>
+            <w:vAlign w:val="center"/>
+            <w:hideMark/>
+          </w:tcPr>
+          <w:p>
+            <w:pPr>
+              <w:spacing w:after="80" w:line="360" w:lineRule="auto"/>
+              <w:ind w:left="142"/>
+              <w:rPr>
+                <w:rFonts w:ascii="Times New Roman" w:eastAsia="Times New Roman" w:hAnsi="Times New Roman" w:cs="Times New Roman"/>
+                <w:sz w:val="24"/>
+                <w:szCs w:val="24"/>
+                <w:lang w:val="en-ID"/>
+              </w:rPr>
+            </w:pPr>
+            <w:r>
+              <w:rPr>
+                <w:rFonts w:ascii="Times New Roman" w:eastAsia="Times New Roman" w:hAnsi="Times New Roman" w:cs="Times New Roman"/>
+                <w:sz w:val="24"/>
+                <w:szCs w:val="24"/>
+                <w:lang w:val="en-ID"/>
+              </w:rPr>
+              <w:t>20241320011</w:t>
+            </w:r>
+          </w:p>
+        </w:tc>
+        <w:tc>
+          <w:tcPr>
+            <w:tcW w:w="1734" w:type="dxa"/>
+            <w:shd w:val="clear" w:color="auto" w:fill="auto"/>
+            <w:vAlign w:val="center"/>
+            <w:hideMark/>
+          </w:tcPr>
+          <w:p>
+            <w:pPr>
+              <w:spacing w:after="80" w:line="360" w:lineRule="auto"/>
+              <w:ind w:left="142"/>
+              <w:rPr>
+                <w:rFonts w:ascii="Times New Roman" w:eastAsia="Times New Roman" w:hAnsi="Times New Roman" w:cs="Times New Roman"/>
+                <w:sz w:val="24"/>
+                <w:szCs w:val="24"/>
+                <w:lang w:val="en-ID"/>
+              </w:rPr>
+            </w:pPr>
+            <w:r>
+              <w:rPr>
+                <w:rFonts w:ascii="Times New Roman" w:eastAsia="Times New Roman" w:hAnsi="Times New Roman" w:cs="Times New Roman"/>
+                <w:sz w:val="24"/>
+                <w:szCs w:val="24"/>
+                <w:lang w:val="en-ID"/>
+              </w:rPr>
+              <w:t>Frontend Mobile Developer</w:t>
+            </w:r>
+          </w:p>
+        </w:tc>
+        <w:tc>
+          <w:tcPr>
+            <w:tcW w:w="2819" w:type="dxa"/>
+            <w:shd w:val="clear" w:color="auto" w:fill="auto"/>
+            <w:vAlign w:val="center"/>
+            <w:hideMark/>
+          </w:tcPr>
+          <w:p>
+            <w:pPr>
+              <w:spacing w:after="80" w:line="360" w:lineRule="auto"/>
+              <w:ind w:left="142"/>
+              <w:rPr>
+                <w:rFonts w:ascii="Times New Roman" w:eastAsia="Times New Roman" w:hAnsi="Times New Roman" w:cs="Times New Roman"/>
+                <w:sz w:val="24"/>
+                <w:szCs w:val="24"/>
+                <w:lang w:val="sv-SE"/>
+              </w:rPr>
+            </w:pPr>
+            <w:r>
+              <w:rPr>
+                <w:rFonts w:ascii="Times New Roman" w:eastAsia="Times New Roman" w:hAnsi="Times New Roman" w:cs="Times New Roman"/>
+                <w:sz w:val="24"/>
+                <w:szCs w:val="24"/>
+                <w:lang w:val="sv-SE"/>
+              </w:rPr>
+              <w:t>Mengembangkan antarmuka aplikasi mobile, mengimplementasikan desain UI/UX pada platform mobile, serta memastikan tampilan dan fungsi berjalan dengan baik.</w:t>
+            </w:r>
+          </w:p>
+        </w:tc>
+      </w:tr>
+      <w:tr>
+        <w:trPr>
+          <w:tblCellSpacing w:w="15" w:type="dxa"/>
+        </w:trPr>
+        <w:tc>
+          <w:tcPr>
+            <w:tcW w:w="1084" w:type="dxa"/>
+            <w:shd w:val="clear" w:color="auto" w:fill="auto"/>
+            <w:vAlign w:val="center"/>
+            <w:hideMark/>
+          </w:tcPr>
+          <w:p>
+            <w:pPr>
+              <w:spacing w:after="80" w:line="360" w:lineRule="auto"/>
+              <w:ind w:left="142"/>
+              <w:rPr>
+                <w:rFonts w:ascii="Times New Roman" w:eastAsia="Times New Roman" w:hAnsi="Times New Roman" w:cs="Times New Roman"/>
+                <w:sz w:val="24"/>
+                <w:szCs w:val="24"/>
+                <w:lang w:val="en-ID"/>
+              </w:rPr>
+            </w:pPr>
+            <w:r>
+              <w:rPr>
+                <w:rFonts w:ascii="Times New Roman" w:eastAsia="Times New Roman" w:hAnsi="Times New Roman" w:cs="Times New Roman"/>
+                <w:sz w:val="24"/>
+                <w:szCs w:val="24"/>
+                <w:lang w:val="en-ID"/>
+              </w:rPr>
+              <w:t>3</w:t>
+            </w:r>
+          </w:p>
+        </w:tc>
+        <w:tc>
+          <w:tcPr>
+            <w:tcW w:w="1429" w:type="dxa"/>
+            <w:shd w:val="clear" w:color="auto" w:fill="auto"/>
+            <w:vAlign w:val="center"/>
+            <w:hideMark/>
+          </w:tcPr>
+          <w:p>
+            <w:pPr>
+              <w:spacing w:after="80" w:line="360" w:lineRule="auto"/>
+              <w:ind w:left="142"/>
+              <w:rPr>
+                <w:rFonts w:ascii="Times New Roman" w:eastAsia="Times New Roman" w:hAnsi="Times New Roman" w:cs="Times New Roman"/>
+                <w:sz w:val="24"/>
+                <w:szCs w:val="24"/>
+                <w:lang w:val="en-ID"/>
+              </w:rPr>
+            </w:pPr>
+            <w:r>
+              <w:rPr>
+                <w:rFonts w:ascii="Times New Roman" w:eastAsia="Times New Roman" w:hAnsi="Times New Roman" w:cs="Times New Roman"/>
+                <w:sz w:val="24"/>
+                <w:szCs w:val="24"/>
+                <w:lang w:val="en-ID"/>
+              </w:rPr>
+              <w:t>Muhamad Alvin Ramadhan</w:t>
+            </w:r>
+          </w:p>
+        </w:tc>
+        <w:tc>
+          <w:tcPr>
+            <w:tcW w:w="1773" w:type="dxa"/>
+            <w:shd w:val="clear" w:color="auto" w:fill="auto"/>
+            <w:vAlign w:val="center"/>
+            <w:hideMark/>
+          </w:tcPr>
+          <w:p>
+            <w:pPr>
+              <w:spacing w:after="80" w:line="360" w:lineRule="auto"/>
+              <w:ind w:left="142"/>
+              <w:rPr>
+                <w:rFonts w:ascii="Times New Roman" w:eastAsia="Times New Roman" w:hAnsi="Times New Roman" w:cs="Times New Roman"/>
+                <w:sz w:val="24"/>
+                <w:szCs w:val="24"/>
+                <w:lang w:val="en-ID"/>
+              </w:rPr>
+            </w:pPr>
+            <w:r>
+              <w:rPr>
+                <w:rFonts w:ascii="Times New Roman" w:eastAsia="Times New Roman" w:hAnsi="Times New Roman" w:cs="Times New Roman"/>
+                <w:sz w:val="24"/>
+                <w:szCs w:val="24"/>
+                <w:lang w:val="en-ID"/>
+              </w:rPr>
+              <w:t>20241320035</w:t>
+            </w:r>
+          </w:p>
+        </w:tc>
+        <w:tc>
+          <w:tcPr>
+            <w:tcW w:w="1734" w:type="dxa"/>
+            <w:shd w:val="clear" w:color="auto" w:fill="auto"/>
+            <w:vAlign w:val="center"/>
+            <w:hideMark/>
+          </w:tcPr>
+          <w:p>
+            <w:pPr>
+              <w:spacing w:after="80" w:line="360" w:lineRule="auto"/>
+              <w:ind w:left="142"/>
+              <w:rPr>
+                <w:rFonts w:ascii="Times New Roman" w:eastAsia="Times New Roman" w:hAnsi="Times New Roman" w:cs="Times New Roman"/>
+                <w:sz w:val="24"/>
+                <w:szCs w:val="24"/>
+                <w:lang w:val="en-ID"/>
+              </w:rPr>
+            </w:pPr>
+            <w:r>
+              <w:rPr>
+                <w:rFonts w:ascii="Times New Roman" w:eastAsia="Times New Roman" w:hAnsi="Times New Roman" w:cs="Times New Roman"/>
+                <w:sz w:val="24"/>
+                <w:szCs w:val="24"/>
+                <w:lang w:val="en-ID"/>
+              </w:rPr>
+              <w:t>Frontend Web Developer</w:t>
+            </w:r>
+          </w:p>
+        </w:tc>
+        <w:tc>
+          <w:tcPr>
+            <w:tcW w:w="2819" w:type="dxa"/>
+            <w:shd w:val="clear" w:color="auto" w:fill="auto"/>
+            <w:vAlign w:val="center"/>
+            <w:hideMark/>
+          </w:tcPr>
+          <w:p>
+            <w:pPr>
+              <w:spacing w:after="80" w:line="360" w:lineRule="auto"/>
+              <w:ind w:left="142"/>
+              <w:rPr>
+                <w:rFonts w:ascii="Times New Roman" w:eastAsia="Times New Roman" w:hAnsi="Times New Roman" w:cs="Times New Roman"/>
+                <w:sz w:val="24"/>
+                <w:szCs w:val="24"/>
+                <w:lang w:val="sv-SE"/>
+              </w:rPr>
+            </w:pPr>
+            <w:r>
+              <w:rPr>
+                <w:rFonts w:ascii="Times New Roman" w:eastAsia="Times New Roman" w:hAnsi="Times New Roman" w:cs="Times New Roman"/>
+                <w:sz w:val="24"/>
+                <w:szCs w:val="24"/>
+                <w:lang w:val="sv-SE"/>
+              </w:rPr>
+              <w:t>Mengembangkan tampilan antarmuka website, mengintegrasikan desain dengan sistem backend, serta memastikan pengalaman pengguna berjalan optimal.</w:t>
+            </w:r>
+          </w:p>
+        </w:tc>
+      </w:tr>
+      <w:tr>
+        <w:trPr>
+          <w:tblCellSpacing w:w="15" w:type="dxa"/>
+        </w:trPr>
+        <w:tc>
+          <w:tcPr>
+            <w:tcW w:w="1084" w:type="dxa"/>
+            <w:shd w:val="clear" w:color="auto" w:fill="auto"/>
+            <w:vAlign w:val="center"/>
+            <w:hideMark/>
+          </w:tcPr>
+          <w:p>
+            <w:pPr>
+              <w:spacing w:after="80" w:line="360" w:lineRule="auto"/>
+              <w:ind w:left="142"/>
+              <w:rPr>
+                <w:rFonts w:ascii="Times New Roman" w:eastAsia="Times New Roman" w:hAnsi="Times New Roman" w:cs="Times New Roman"/>
+                <w:sz w:val="24"/>
+                <w:szCs w:val="24"/>
+                <w:lang w:val="en-ID"/>
+              </w:rPr>
+            </w:pPr>
+            <w:r>
+              <w:rPr>
+                <w:rFonts w:ascii="Times New Roman" w:eastAsia="Times New Roman" w:hAnsi="Times New Roman" w:cs="Times New Roman"/>
+                <w:sz w:val="24"/>
+                <w:szCs w:val="24"/>
+                <w:lang w:val="en-ID"/>
+              </w:rPr>
+              <w:t>4</w:t>
+            </w:r>
+          </w:p>
+        </w:tc>
+        <w:tc>
+          <w:tcPr>
+            <w:tcW w:w="1429" w:type="dxa"/>
+            <w:shd w:val="clear" w:color="auto" w:fill="auto"/>
+            <w:vAlign w:val="center"/>
+            <w:hideMark/>
+          </w:tcPr>
+          <w:p>
+            <w:pPr>
+              <w:spacing w:after="80" w:line="360" w:lineRule="auto"/>
+              <w:ind w:left="142"/>
+              <w:rPr>
+                <w:rFonts w:ascii="Times New Roman" w:eastAsia="Times New Roman" w:hAnsi="Times New Roman" w:cs="Times New Roman"/>
+                <w:sz w:val="24"/>
+                <w:szCs w:val="24"/>
+                <w:lang w:val="en-ID"/>
+              </w:rPr>
+            </w:pPr>
+            <w:r>
+              <w:rPr>
+                <w:rFonts w:ascii="Times New Roman" w:eastAsia="Times New Roman" w:hAnsi="Times New Roman" w:cs="Times New Roman"/>
+                <w:sz w:val="24"/>
+                <w:szCs w:val="24"/>
+                <w:lang w:val="en-ID"/>
+              </w:rPr>
+              <w:t>Akbar</w:t>
+            </w:r>
+          </w:p>
+        </w:tc>
+        <w:tc>
+          <w:tcPr>
+            <w:tcW w:w="1773" w:type="dxa"/>
+            <w:shd w:val="clear" w:color="auto" w:fill="auto"/>
+            <w:vAlign w:val="center"/>
+            <w:hideMark/>
+          </w:tcPr>
+          <w:p>
+            <w:pPr>
+              <w:spacing w:after="80" w:line="360" w:lineRule="auto"/>
+              <w:ind w:left="142"/>
+              <w:rPr>
+                <w:rFonts w:ascii="Times New Roman" w:eastAsia="Times New Roman" w:hAnsi="Times New Roman" w:cs="Times New Roman"/>
+                <w:sz w:val="24"/>
+                <w:szCs w:val="24"/>
+                <w:lang w:val="en-ID"/>
+              </w:rPr>
+            </w:pPr>
+            <w:r>
+              <w:rPr>
+                <w:rFonts w:ascii="Times New Roman" w:eastAsia="Times New Roman" w:hAnsi="Times New Roman" w:cs="Times New Roman"/>
+                <w:sz w:val="24"/>
+                <w:szCs w:val="24"/>
+                <w:lang w:val="en-ID"/>
+              </w:rPr>
+              <w:t>20241320017</w:t>
+            </w:r>
+          </w:p>
+        </w:tc>
+        <w:tc>
+          <w:tcPr>
+            <w:tcW w:w="1734" w:type="dxa"/>
+            <w:shd w:val="clear" w:color="auto" w:fill="auto"/>
+            <w:vAlign w:val="center"/>
+            <w:hideMark/>
+          </w:tcPr>
+          <w:p>
+            <w:pPr>
+              <w:spacing w:after="80" w:line="360" w:lineRule="auto"/>
+              <w:ind w:left="142"/>
+              <w:rPr>
+                <w:rFonts w:ascii="Times New Roman" w:eastAsia="Times New Roman" w:hAnsi="Times New Roman" w:cs="Times New Roman"/>
+                <w:sz w:val="24"/>
+                <w:szCs w:val="24"/>
+                <w:lang w:val="en-ID"/>
+              </w:rPr>
+            </w:pPr>
+            <w:proofErr w:type="spellStart"/>
+            <w:r>
+              <w:rPr>
+                <w:rFonts w:ascii="Times New Roman" w:eastAsia="Times New Roman" w:hAnsi="Times New Roman" w:cs="Times New Roman"/>
+                <w:sz w:val="24"/>
+                <w:szCs w:val="24"/>
+                <w:lang w:val="en-ID"/>
+              </w:rPr>
+              <w:t>Dokumentasi</w:t>
+            </w:r>
+            <w:proofErr w:type="spellEnd"/>
+          </w:p>
+        </w:tc>
+        <w:tc>
+          <w:tcPr>
+            <w:tcW w:w="2819" w:type="dxa"/>
+            <w:shd w:val="clear" w:color="auto" w:fill="auto"/>
+            <w:vAlign w:val="center"/>
+            <w:hideMark/>
+          </w:tcPr>
+          <w:p>
+            <w:pPr>
+              <w:spacing w:after="80" w:line="360" w:lineRule="auto"/>
+              <w:ind w:left="142"/>
+              <w:rPr>
+                <w:rFonts w:ascii="Times New Roman" w:eastAsia="Times New Roman" w:hAnsi="Times New Roman" w:cs="Times New Roman"/>
+                <w:sz w:val="24"/>
+                <w:szCs w:val="24"/>
+                <w:lang w:val="sv-SE"/>
+              </w:rPr>
+            </w:pPr>
+            <w:r>
+              <w:rPr>
+                <w:rFonts w:ascii="Times New Roman" w:eastAsia="Times New Roman" w:hAnsi="Times New Roman" w:cs="Times New Roman"/>
+                <w:sz w:val="24"/>
+                <w:szCs w:val="24"/>
+                <w:lang w:val="sv-SE"/>
+              </w:rPr>
+              <w:t>Menyusun dan mengelola dokumentasi proyek, termasuk laporan, SRS, revisi dokumen, serta dokumentasi hasil pengembangan sistem.</w:t>
+            </w:r>
+          </w:p>
+        </w:tc>
+      </w:tr>
+      <w:tr>
+        <w:trPr>
+          <w:tblCellSpacing w:w="15" w:type="dxa"/>
+        </w:trPr>
+        <w:tc>
+          <w:tcPr>
+            <w:tcW w:w="1084" w:type="dxa"/>
+            <w:shd w:val="clear" w:color="auto" w:fill="auto"/>
+            <w:vAlign w:val="center"/>
+            <w:hideMark/>
+          </w:tcPr>
+          <w:p>
+            <w:pPr>
+              <w:spacing w:after="80" w:line="360" w:lineRule="auto"/>
+              <w:ind w:left="142"/>
+              <w:rPr>
+                <w:rFonts w:ascii="Times New Roman" w:eastAsia="Times New Roman" w:hAnsi="Times New Roman" w:cs="Times New Roman"/>
+                <w:sz w:val="24"/>
+                <w:szCs w:val="24"/>
+                <w:lang w:val="en-ID"/>
+              </w:rPr>
+            </w:pPr>
+            <w:r>
+              <w:rPr>
+                <w:rFonts w:ascii="Times New Roman" w:eastAsia="Times New Roman" w:hAnsi="Times New Roman" w:cs="Times New Roman"/>
+                <w:sz w:val="24"/>
+                <w:szCs w:val="24"/>
+                <w:lang w:val="en-ID"/>
+              </w:rPr>
+              <w:t>5</w:t>
+            </w:r>
+          </w:p>
+        </w:tc>
+        <w:tc>
+          <w:tcPr>
+            <w:tcW w:w="1429" w:type="dxa"/>
+            <w:shd w:val="clear" w:color="auto" w:fill="auto"/>
+            <w:vAlign w:val="center"/>
+            <w:hideMark/>
+          </w:tcPr>
+          <w:p>
+            <w:pPr>
+              <w:spacing w:after="80" w:line="360" w:lineRule="auto"/>
+              <w:ind w:left="142"/>
+              <w:rPr>
+                <w:rFonts w:ascii="Times New Roman" w:eastAsia="Times New Roman" w:hAnsi="Times New Roman" w:cs="Times New Roman"/>
+                <w:sz w:val="24"/>
+                <w:szCs w:val="24"/>
+                <w:lang w:val="en-ID"/>
+              </w:rPr>
+            </w:pPr>
+            <w:r>
+              <w:rPr>
+                <w:rFonts w:ascii="Times New Roman" w:eastAsia="Times New Roman" w:hAnsi="Times New Roman" w:cs="Times New Roman"/>
+                <w:sz w:val="24"/>
+                <w:szCs w:val="24"/>
+                <w:lang w:val="en-ID"/>
+              </w:rPr>
+              <w:t xml:space="preserve">Eka </w:t>
+            </w:r>
+            <w:proofErr w:type="spellStart"/>
+            <w:r>
+              <w:rPr>
+                <w:rFonts w:ascii="Times New Roman" w:eastAsia="Times New Roman" w:hAnsi="Times New Roman" w:cs="Times New Roman"/>
+                <w:sz w:val="24"/>
+                <w:szCs w:val="24"/>
+                <w:lang w:val="en-ID"/>
+              </w:rPr>
+              <w:t>Febryanto</w:t>
+            </w:r>
+            <w:proofErr w:type="spellEnd"/>
+          </w:p>
+        </w:tc>
+        <w:tc>
+          <w:tcPr>
+            <w:tcW w:w="1773" w:type="dxa"/>
+            <w:shd w:val="clear" w:color="auto" w:fill="auto"/>
+            <w:vAlign w:val="center"/>
+            <w:hideMark/>
+          </w:tcPr>
+          <w:p>
+            <w:pPr>
+              <w:spacing w:after="80" w:line="360" w:lineRule="auto"/>
+              <w:ind w:left="142"/>
+              <w:rPr>
+                <w:rFonts w:ascii="Times New Roman" w:eastAsia="Times New Roman" w:hAnsi="Times New Roman" w:cs="Times New Roman"/>
+                <w:sz w:val="24"/>
+                <w:szCs w:val="24"/>
+                <w:lang w:val="en-ID"/>
+              </w:rPr>
+            </w:pPr>
+            <w:r>
+              <w:rPr>
+                <w:rFonts w:ascii="Times New Roman" w:eastAsia="Times New Roman" w:hAnsi="Times New Roman" w:cs="Times New Roman"/>
+                <w:sz w:val="24"/>
+                <w:szCs w:val="24"/>
+                <w:lang w:val="en-ID"/>
+              </w:rPr>
+              <w:t>20241320014</w:t>
+            </w:r>
+          </w:p>
+        </w:tc>
+        <w:tc>
+          <w:tcPr>
+            <w:tcW w:w="1734" w:type="dxa"/>
+            <w:shd w:val="clear" w:color="auto" w:fill="auto"/>
+            <w:vAlign w:val="center"/>
+            <w:hideMark/>
+          </w:tcPr>
+          <w:p>
+            <w:pPr>
+              <w:spacing w:after="80" w:line="360" w:lineRule="auto"/>
+              <w:ind w:left="142"/>
+              <w:rPr>
+                <w:rFonts w:ascii="Times New Roman" w:eastAsia="Times New Roman" w:hAnsi="Times New Roman" w:cs="Times New Roman"/>
+                <w:sz w:val="24"/>
+                <w:szCs w:val="24"/>
+                <w:lang w:val="en-ID"/>
+              </w:rPr>
+            </w:pPr>
+            <w:r>
+              <w:rPr>
+                <w:rFonts w:ascii="Times New Roman" w:eastAsia="Times New Roman" w:hAnsi="Times New Roman" w:cs="Times New Roman"/>
+                <w:sz w:val="24"/>
+                <w:szCs w:val="24"/>
+                <w:lang w:val="en-ID"/>
+              </w:rPr>
+              <w:t>Backend Web Developer</w:t>
+            </w:r>
+          </w:p>
+        </w:tc>
+        <w:tc>
+          <w:tcPr>
+            <w:tcW w:w="2819" w:type="dxa"/>
+            <w:shd w:val="clear" w:color="auto" w:fill="auto"/>
+            <w:vAlign w:val="center"/>
+            <w:hideMark/>
+          </w:tcPr>
+          <w:p>
+            <w:pPr>
+              <w:spacing w:after="80" w:line="360" w:lineRule="auto"/>
+              <w:ind w:left="142"/>
+              <w:rPr>
+                <w:rFonts w:ascii="Times New Roman" w:eastAsia="Times New Roman" w:hAnsi="Times New Roman" w:cs="Times New Roman"/>
+                <w:sz w:val="24"/>
+                <w:szCs w:val="24"/>
+                <w:lang w:val="sv-SE"/>
+              </w:rPr>
+            </w:pPr>
+            <w:r>
+              <w:rPr>
+                <w:rFonts w:ascii="Times New Roman" w:eastAsia="Times New Roman" w:hAnsi="Times New Roman" w:cs="Times New Roman"/>
+                <w:sz w:val="24"/>
+                <w:szCs w:val="24"/>
+                <w:lang w:val="sv-SE"/>
+              </w:rPr>
+              <w:t>Mengembangkan logika sistem pada sisi server website, mengelola database, API, dan integrasi antar modul sistem berbasis web.</w:t>
+            </w:r>
+          </w:p>
+        </w:tc>
+      </w:tr>
+      <w:tr>
+        <w:trPr>
+          <w:tblCellSpacing w:w="15" w:type="dxa"/>
+        </w:trPr>
+        <w:tc>
+          <w:tcPr>
+            <w:tcW w:w="1084" w:type="dxa"/>
+            <w:shd w:val="clear" w:color="auto" w:fill="auto"/>
+            <w:vAlign w:val="center"/>
+            <w:hideMark/>
+          </w:tcPr>
+          <w:p>
+            <w:pPr>
+              <w:spacing w:after="80" w:line="360" w:lineRule="auto"/>
+              <w:ind w:left="142"/>
+              <w:rPr>
+                <w:rFonts w:ascii="Times New Roman" w:eastAsia="Times New Roman" w:hAnsi="Times New Roman" w:cs="Times New Roman"/>
+                <w:sz w:val="24"/>
+                <w:szCs w:val="24"/>
+                <w:lang w:val="en-ID"/>
+              </w:rPr>
+            </w:pPr>
+            <w:r>
+              <w:rPr>
+                <w:rFonts w:ascii="Times New Roman" w:eastAsia="Times New Roman" w:hAnsi="Times New Roman" w:cs="Times New Roman"/>
+                <w:sz w:val="24"/>
+                <w:szCs w:val="24"/>
+                <w:lang w:val="en-ID"/>
+              </w:rPr>
+              <w:t>6</w:t>
+            </w:r>
+          </w:p>
+        </w:tc>
+        <w:tc>
+          <w:tcPr>
+            <w:tcW w:w="1429" w:type="dxa"/>
+            <w:shd w:val="clear" w:color="auto" w:fill="auto"/>
+            <w:vAlign w:val="center"/>
+            <w:hideMark/>
+          </w:tcPr>
+          <w:p>
+            <w:pPr>
+              <w:spacing w:after="80" w:line="360" w:lineRule="auto"/>
+              <w:ind w:left="142"/>
+              <w:rPr>
+                <w:rFonts w:ascii="Times New Roman" w:eastAsia="Times New Roman" w:hAnsi="Times New Roman" w:cs="Times New Roman"/>
+                <w:sz w:val="24"/>
+                <w:szCs w:val="24"/>
+                <w:lang w:val="en-ID"/>
+              </w:rPr>
+            </w:pPr>
+            <w:proofErr w:type="spellStart"/>
+            <w:r>
+              <w:rPr>
+                <w:rFonts w:ascii="Times New Roman" w:eastAsia="Times New Roman" w:hAnsi="Times New Roman" w:cs="Times New Roman"/>
+                <w:sz w:val="24"/>
+                <w:szCs w:val="24"/>
+                <w:lang w:val="en-ID"/>
+              </w:rPr>
+              <w:t>Sopyan</w:t>
+            </w:r>
+            <w:proofErr w:type="spellEnd"/>
+            <w:r>
+              <w:rPr>
+                <w:rFonts w:ascii="Times New Roman" w:eastAsia="Times New Roman" w:hAnsi="Times New Roman" w:cs="Times New Roman"/>
+                <w:sz w:val="24"/>
+                <w:szCs w:val="24"/>
+                <w:lang w:val="en-ID"/>
+              </w:rPr>
+              <w:t xml:space="preserve"> </w:t>
+            </w:r>
+            <w:proofErr w:type="spellStart"/>
+            <w:r>
+              <w:rPr>
+                <w:rFonts w:ascii="Times New Roman" w:eastAsia="Times New Roman" w:hAnsi="Times New Roman" w:cs="Times New Roman"/>
+                <w:sz w:val="24"/>
+                <w:szCs w:val="24"/>
+                <w:lang w:val="en-ID"/>
+              </w:rPr>
+              <w:t>Rinaldhi</w:t>
+            </w:r>
+            <w:proofErr w:type="spellEnd"/>
+          </w:p>
+        </w:tc>
+        <w:tc>
+          <w:tcPr>
+            <w:tcW w:w="1773" w:type="dxa"/>
+            <w:shd w:val="clear" w:color="auto" w:fill="auto"/>
+            <w:vAlign w:val="center"/>
+            <w:hideMark/>
+          </w:tcPr>
+          <w:p>
+            <w:pPr>
+              <w:spacing w:after="80" w:line="360" w:lineRule="auto"/>
+              <w:ind w:left="142"/>
+              <w:rPr>
+                <w:rFonts w:ascii="Times New Roman" w:eastAsia="Times New Roman" w:hAnsi="Times New Roman" w:cs="Times New Roman"/>
+                <w:sz w:val="24"/>
+                <w:szCs w:val="24"/>
+                <w:lang w:val="en-ID"/>
+              </w:rPr>
+            </w:pPr>
+            <w:r>
+              <w:rPr>
+                <w:rFonts w:ascii="Times New Roman" w:eastAsia="Times New Roman" w:hAnsi="Times New Roman" w:cs="Times New Roman"/>
+                <w:sz w:val="24"/>
+                <w:szCs w:val="24"/>
+                <w:lang w:val="en-ID"/>
+              </w:rPr>
+              <w:t>20241320028</w:t>
+            </w:r>
+          </w:p>
+        </w:tc>
+        <w:tc>
+          <w:tcPr>
+            <w:tcW w:w="1734" w:type="dxa"/>
+            <w:shd w:val="clear" w:color="auto" w:fill="auto"/>
+            <w:vAlign w:val="center"/>
+            <w:hideMark/>
+          </w:tcPr>
+          <w:p>
+            <w:pPr>
+              <w:spacing w:after="80" w:line="360" w:lineRule="auto"/>
+              <w:ind w:left="142"/>
+              <w:rPr>
+                <w:rFonts w:ascii="Times New Roman" w:eastAsia="Times New Roman" w:hAnsi="Times New Roman" w:cs="Times New Roman"/>
+                <w:sz w:val="24"/>
+                <w:szCs w:val="24"/>
+                <w:lang w:val="en-ID"/>
+              </w:rPr>
+            </w:pPr>
+            <w:r>
+              <w:rPr>
+                <w:rFonts w:ascii="Times New Roman" w:eastAsia="Times New Roman" w:hAnsi="Times New Roman" w:cs="Times New Roman"/>
+                <w:sz w:val="24"/>
+                <w:szCs w:val="24"/>
+                <w:lang w:val="en-ID"/>
+              </w:rPr>
+              <w:t>Backend Mobile Developer</w:t>
+            </w:r>
+          </w:p>
+        </w:tc>
+        <w:tc>
+          <w:tcPr>
+            <w:tcW w:w="2819" w:type="dxa"/>
+            <w:shd w:val="clear" w:color="auto" w:fill="auto"/>
+            <w:vAlign w:val="center"/>
+            <w:hideMark/>
+          </w:tcPr>
+          <w:p>
+            <w:pPr>
+              <w:spacing w:after="80" w:line="360" w:lineRule="auto"/>
+              <w:ind w:left="142"/>
+              <w:rPr>
+                <w:rFonts w:ascii="Times New Roman" w:eastAsia="Times New Roman" w:hAnsi="Times New Roman" w:cs="Times New Roman"/>
+                <w:sz w:val="24"/>
+                <w:szCs w:val="24"/>
+                <w:lang w:val="sv-SE"/>
+              </w:rPr>
+            </w:pPr>
+            <w:r>
+              <w:rPr>
+                <w:rFonts w:ascii="Times New Roman" w:eastAsia="Times New Roman" w:hAnsi="Times New Roman" w:cs="Times New Roman"/>
+                <w:sz w:val="24"/>
+                <w:szCs w:val="24"/>
+                <w:lang w:val="sv-SE"/>
+              </w:rPr>
+              <w:t>Mengembangkan layanan backend yang digunakan aplikasi mobile, termasuk integrasi API, pengelolaan data, dan komunikasi sistem mobile dengan server.</w:t>
+            </w:r>
+          </w:p>
+        </w:tc>
+      </w:tr>
+      <w:tr>
+        <w:trPr>
+          <w:tblCellSpacing w:w="15" w:type="dxa"/>
+        </w:trPr>
+        <w:tc>
+          <w:tcPr>
+            <w:tcW w:w="1084" w:type="dxa"/>
+            <w:shd w:val="clear" w:color="auto" w:fill="auto"/>
+            <w:vAlign w:val="center"/>
+            <w:hideMark/>
+          </w:tcPr>
+          <w:p>
+            <w:pPr>
+              <w:spacing w:after="80" w:line="360" w:lineRule="auto"/>
+              <w:ind w:left="142"/>
+              <w:rPr>
+                <w:rFonts w:ascii="Times New Roman" w:eastAsia="Times New Roman" w:hAnsi="Times New Roman" w:cs="Times New Roman"/>
+                <w:sz w:val="24"/>
+                <w:szCs w:val="24"/>
+                <w:lang w:val="en-ID"/>
+              </w:rPr>
+            </w:pPr>
+            <w:r>
+              <w:rPr>
+                <w:rFonts w:ascii="Times New Roman" w:eastAsia="Times New Roman" w:hAnsi="Times New Roman" w:cs="Times New Roman"/>
+                <w:sz w:val="24"/>
+                <w:szCs w:val="24"/>
+                <w:lang w:val="en-ID"/>
+              </w:rPr>
+              <w:t>7</w:t>
+            </w:r>
+          </w:p>
+        </w:tc>
+        <w:tc>
+          <w:tcPr>
+            <w:tcW w:w="1429" w:type="dxa"/>
+            <w:shd w:val="clear" w:color="auto" w:fill="auto"/>
+            <w:vAlign w:val="center"/>
+            <w:hideMark/>
+          </w:tcPr>
+          <w:p>
+            <w:pPr>
+              <w:spacing w:after="80" w:line="360" w:lineRule="auto"/>
+              <w:ind w:left="142"/>
+              <w:rPr>
+                <w:rFonts w:ascii="Times New Roman" w:eastAsia="Times New Roman" w:hAnsi="Times New Roman" w:cs="Times New Roman"/>
+                <w:sz w:val="24"/>
+                <w:szCs w:val="24"/>
+                <w:lang w:val="en-ID"/>
+              </w:rPr>
+            </w:pPr>
+            <w:r>
+              <w:rPr>
+                <w:rFonts w:ascii="Times New Roman" w:eastAsia="Times New Roman" w:hAnsi="Times New Roman" w:cs="Times New Roman"/>
+                <w:sz w:val="24"/>
+                <w:szCs w:val="24"/>
+                <w:lang w:val="en-ID"/>
+              </w:rPr>
+              <w:t>Julia Habibah</w:t>
+            </w:r>
+          </w:p>
+        </w:tc>
+        <w:tc>
+          <w:tcPr>
+            <w:tcW w:w="1773" w:type="dxa"/>
+            <w:shd w:val="clear" w:color="auto" w:fill="auto"/>
+            <w:vAlign w:val="center"/>
+            <w:hideMark/>
+          </w:tcPr>
+          <w:p>
+            <w:pPr>
+              <w:spacing w:after="80" w:line="360" w:lineRule="auto"/>
+              <w:ind w:left="142"/>
+              <w:rPr>
+                <w:rFonts w:ascii="Times New Roman" w:eastAsia="Times New Roman" w:hAnsi="Times New Roman" w:cs="Times New Roman"/>
+                <w:sz w:val="24"/>
+                <w:szCs w:val="24"/>
+                <w:lang w:val="en-ID"/>
+              </w:rPr>
+            </w:pPr>
+            <w:r>
+              <w:rPr>
+                <w:rFonts w:ascii="Times New Roman" w:eastAsia="Times New Roman" w:hAnsi="Times New Roman" w:cs="Times New Roman"/>
+                <w:sz w:val="24"/>
+                <w:szCs w:val="24"/>
+                <w:lang w:val="en-ID"/>
+              </w:rPr>
+              <w:t>20241320020</w:t>
+            </w:r>
+          </w:p>
+        </w:tc>
+        <w:tc>
+          <w:tcPr>
+            <w:tcW w:w="1734" w:type="dxa"/>
+            <w:shd w:val="clear" w:color="auto" w:fill="auto"/>
+            <w:vAlign w:val="center"/>
+            <w:hideMark/>
+          </w:tcPr>
+          <w:p>
+            <w:pPr>
+              <w:spacing w:after="80" w:line="360" w:lineRule="auto"/>
+              <w:ind w:left="142"/>
+              <w:rPr>
+                <w:rFonts w:ascii="Times New Roman" w:eastAsia="Times New Roman" w:hAnsi="Times New Roman" w:cs="Times New Roman"/>
+                <w:sz w:val="24"/>
+                <w:szCs w:val="24"/>
+                <w:lang w:val="en-ID"/>
+              </w:rPr>
+            </w:pPr>
+            <w:r>
+              <w:rPr>
+                <w:rFonts w:ascii="Times New Roman" w:eastAsia="Times New Roman" w:hAnsi="Times New Roman" w:cs="Times New Roman"/>
+                <w:sz w:val="24"/>
+                <w:szCs w:val="24"/>
+                <w:lang w:val="en-ID"/>
+              </w:rPr>
+              <w:t>System Analyst</w:t>
+            </w:r>
+          </w:p>
+        </w:tc>
+        <w:tc>
+          <w:tcPr>
+            <w:tcW w:w="2819" w:type="dxa"/>
+            <w:shd w:val="clear" w:color="auto" w:fill="auto"/>
+            <w:vAlign w:val="center"/>
+            <w:hideMark/>
+          </w:tcPr>
+          <w:p>
+            <w:pPr>
+              <w:spacing w:after="80" w:line="360" w:lineRule="auto"/>
+              <w:ind w:left="142"/>
+              <w:rPr>
+                <w:rFonts w:ascii="Times New Roman" w:eastAsia="Times New Roman" w:hAnsi="Times New Roman" w:cs="Times New Roman"/>
+                <w:sz w:val="24"/>
+                <w:szCs w:val="24"/>
+                <w:lang w:val="sv-SE"/>
+              </w:rPr>
+            </w:pPr>
+            <w:r>
+              <w:rPr>
+                <w:rFonts w:ascii="Times New Roman" w:eastAsia="Times New Roman" w:hAnsi="Times New Roman" w:cs="Times New Roman"/>
+                <w:sz w:val="24"/>
+                <w:szCs w:val="24"/>
+                <w:lang w:val="sv-SE"/>
+              </w:rPr>
+              <w:t>Menganalisis kebutuhan sistem, menyusun spesifikasi kebutuhan perangkat lunak, membuat alur sistem, serta membantu perancangan proses bisnis sistem.</w:t>
+            </w:r>
+          </w:p>
+        </w:tc>
+      </w:tr>
+    </w:tbl>
+    <w:p>
+      <w:pPr>
+        <w:spacing w:after="80" w:line="360" w:lineRule="auto"/>
+        <w:ind w:left="142"/>
+        <w:rPr>
+          <w:rFonts w:ascii="Times New Roman" w:eastAsia="Times New Roman" w:hAnsi="Times New Roman" w:cs="Times New Roman"/>
+          <w:b/>
+          <w:bCs/>
+          <w:sz w:val="24"/>
+          <w:szCs w:val="24"/>
+          <w:lang w:val="sv-SE"/>
+        </w:rPr>
+      </w:pPr>
+    </w:p>
+    <w:p>
+      <w:pPr>
+        <w:pStyle w:val="Judul2"/>
+        <w:rPr>
+          <w:lang w:val="sv-SE"/>
+        </w:rPr>
+      </w:pPr>
+      <w:r>
+        <w:rPr>
+          <w:lang w:val="sv-SE"/>
+        </w:rPr>
+        <w:t>7.3 Mekanisme Koordinasi Tim</w:t>
+      </w:r>
+    </w:p>
+    <w:p>
+      <w:pPr>
+        <w:spacing w:after="80" w:line="360" w:lineRule="auto"/>
+        <w:ind w:left="720" w:firstLine="720"/>
+        <w:rPr>
+          <w:rFonts w:ascii="Times New Roman" w:eastAsia="Times New Roman" w:hAnsi="Times New Roman" w:cs="Times New Roman"/>
+          <w:sz w:val="24"/>
+          <w:szCs w:val="24"/>
+          <w:lang w:val="sv-SE"/>
+        </w:rPr>
+      </w:pPr>
+      <w:r>
+        <w:rPr>
+          <w:rFonts w:ascii="Times New Roman" w:eastAsia="Times New Roman" w:hAnsi="Times New Roman" w:cs="Times New Roman"/>
+          <w:sz w:val="24"/>
+          <w:szCs w:val="24"/>
+          <w:lang w:val="sv-SE"/>
+        </w:rPr>
+        <w:t>Dalam pelaksanaan proyek, seluruh anggota tim melakukan koordinasi secara berkala untuk memantau perkembangan pengerjaan sistem. Setiap anggota bertanggung jawab terhadap tugas yang telah ditentukan dan melaporkan progres pekerjaan kepada Project Manager.</w:t>
+      </w:r>
+    </w:p>
+    <w:p>
+      <w:pPr>
+        <w:spacing w:after="80" w:line="360" w:lineRule="auto"/>
+        <w:ind w:left="720" w:hanging="11"/>
+        <w:rPr>
+          <w:rFonts w:ascii="Times New Roman" w:eastAsia="Times New Roman" w:hAnsi="Times New Roman" w:cs="Times New Roman"/>
+          <w:sz w:val="24"/>
+          <w:szCs w:val="24"/>
+          <w:lang w:val="en-ID"/>
+        </w:rPr>
+      </w:pPr>
+      <w:proofErr w:type="spellStart"/>
+      <w:r>
+        <w:rPr>
+          <w:rFonts w:ascii="Times New Roman" w:eastAsia="Times New Roman" w:hAnsi="Times New Roman" w:cs="Times New Roman"/>
+          <w:sz w:val="24"/>
+          <w:szCs w:val="24"/>
+          <w:lang w:val="en-ID"/>
+        </w:rPr>
+        <w:t>Koordinasi</w:t>
+      </w:r>
+      <w:proofErr w:type="spellEnd"/>
+      <w:r>
+        <w:rPr>
+          <w:rFonts w:ascii="Times New Roman" w:eastAsia="Times New Roman" w:hAnsi="Times New Roman" w:cs="Times New Roman"/>
+          <w:sz w:val="24"/>
+          <w:szCs w:val="24"/>
+          <w:lang w:val="en-ID"/>
+        </w:rPr>
+        <w:t xml:space="preserve"> </w:t>
+      </w:r>
+      <w:proofErr w:type="spellStart"/>
+      <w:r>
+        <w:rPr>
+          <w:rFonts w:ascii="Times New Roman" w:eastAsia="Times New Roman" w:hAnsi="Times New Roman" w:cs="Times New Roman"/>
+          <w:sz w:val="24"/>
+          <w:szCs w:val="24"/>
+          <w:lang w:val="en-ID"/>
+        </w:rPr>
+        <w:t>dilakukan</w:t>
+      </w:r>
+      <w:proofErr w:type="spellEnd"/>
+      <w:r>
+        <w:rPr>
+          <w:rFonts w:ascii="Times New Roman" w:eastAsia="Times New Roman" w:hAnsi="Times New Roman" w:cs="Times New Roman"/>
+          <w:sz w:val="24"/>
+          <w:szCs w:val="24"/>
+          <w:lang w:val="en-ID"/>
+        </w:rPr>
+        <w:t xml:space="preserve"> </w:t>
+      </w:r>
+      <w:proofErr w:type="spellStart"/>
+      <w:r>
+        <w:rPr>
+          <w:rFonts w:ascii="Times New Roman" w:eastAsia="Times New Roman" w:hAnsi="Times New Roman" w:cs="Times New Roman"/>
+          <w:sz w:val="24"/>
+          <w:szCs w:val="24"/>
+          <w:lang w:val="en-ID"/>
+        </w:rPr>
+        <w:t>untuk</w:t>
+      </w:r>
+      <w:proofErr w:type="spellEnd"/>
+      <w:r>
+        <w:rPr>
+          <w:rFonts w:ascii="Times New Roman" w:eastAsia="Times New Roman" w:hAnsi="Times New Roman" w:cs="Times New Roman"/>
+          <w:sz w:val="24"/>
+          <w:szCs w:val="24"/>
+          <w:lang w:val="en-ID"/>
+        </w:rPr>
+        <w:t>:</w:t>
+      </w:r>
+    </w:p>
+    <w:p>
+      <w:pPr>
+        <w:numPr>
+          <w:ilvl w:val="0"/>
+          <w:numId w:val="3"/>
+        </w:numPr>
+        <w:spacing w:after="80" w:line="360" w:lineRule="auto"/>
+        <w:ind w:hanging="11"/>
+        <w:rPr>
+          <w:rFonts w:ascii="Times New Roman" w:eastAsia="Times New Roman" w:hAnsi="Times New Roman" w:cs="Times New Roman"/>
+          <w:sz w:val="24"/>
+          <w:szCs w:val="24"/>
+          <w:lang w:val="sv-SE"/>
+        </w:rPr>
+      </w:pPr>
+      <w:r>
+        <w:rPr>
+          <w:rFonts w:ascii="Times New Roman" w:eastAsia="Times New Roman" w:hAnsi="Times New Roman" w:cs="Times New Roman"/>
+          <w:sz w:val="24"/>
+          <w:szCs w:val="24"/>
+          <w:lang w:val="sv-SE"/>
+        </w:rPr>
+        <w:t xml:space="preserve">Memastikan kesesuaian pengembangan dengan kebutuhan sistem. </w:t>
+      </w:r>
+    </w:p>
+    <w:p>
+      <w:pPr>
+        <w:numPr>
+          <w:ilvl w:val="0"/>
+          <w:numId w:val="3"/>
+        </w:numPr>
+        <w:spacing w:after="80" w:line="360" w:lineRule="auto"/>
+        <w:ind w:hanging="11"/>
+        <w:rPr>
+          <w:rFonts w:ascii="Times New Roman" w:eastAsia="Times New Roman" w:hAnsi="Times New Roman" w:cs="Times New Roman"/>
+          <w:sz w:val="24"/>
+          <w:szCs w:val="24"/>
+          <w:lang w:val="sv-SE"/>
+        </w:rPr>
+      </w:pPr>
+      <w:r>
+        <w:rPr>
+          <w:rFonts w:ascii="Times New Roman" w:eastAsia="Times New Roman" w:hAnsi="Times New Roman" w:cs="Times New Roman"/>
+          <w:sz w:val="24"/>
+          <w:szCs w:val="24"/>
+          <w:lang w:val="sv-SE"/>
+        </w:rPr>
+        <w:t xml:space="preserve">Mengurangi risiko kesalahan integrasi antar modul. </w:t>
+      </w:r>
+    </w:p>
+    <w:p>
+      <w:pPr>
+        <w:numPr>
+          <w:ilvl w:val="0"/>
+          <w:numId w:val="3"/>
+        </w:numPr>
+        <w:spacing w:after="80" w:line="360" w:lineRule="auto"/>
+        <w:ind w:hanging="11"/>
+        <w:rPr>
+          <w:rFonts w:ascii="Times New Roman" w:eastAsia="Times New Roman" w:hAnsi="Times New Roman" w:cs="Times New Roman"/>
+          <w:sz w:val="24"/>
+          <w:szCs w:val="24"/>
+          <w:lang w:val="sv-SE"/>
+        </w:rPr>
+      </w:pPr>
+      <w:r>
+        <w:rPr>
+          <w:rFonts w:ascii="Times New Roman" w:eastAsia="Times New Roman" w:hAnsi="Times New Roman" w:cs="Times New Roman"/>
+          <w:sz w:val="24"/>
+          <w:szCs w:val="24"/>
+          <w:lang w:val="sv-SE"/>
+        </w:rPr>
+        <w:t xml:space="preserve">Memastikan seluruh fitur dapat berjalan sesuai spesifikasi. </w:t>
+      </w:r>
+    </w:p>
+    <w:p>
+      <w:pPr>
+        <w:numPr>
+          <w:ilvl w:val="0"/>
+          <w:numId w:val="3"/>
+        </w:numPr>
+        <w:spacing w:after="80" w:line="360" w:lineRule="auto"/>
+        <w:ind w:hanging="11"/>
+        <w:rPr>
+          <w:rFonts w:ascii="Times New Roman" w:eastAsia="Times New Roman" w:hAnsi="Times New Roman" w:cs="Times New Roman"/>
+          <w:sz w:val="24"/>
+          <w:szCs w:val="24"/>
+          <w:lang w:val="sv-SE"/>
+        </w:rPr>
+      </w:pPr>
+      <w:r>
+        <w:rPr>
+          <w:rFonts w:ascii="Times New Roman" w:eastAsia="Times New Roman" w:hAnsi="Times New Roman" w:cs="Times New Roman"/>
+          <w:sz w:val="24"/>
+          <w:szCs w:val="24"/>
+          <w:lang w:val="sv-SE"/>
+        </w:rPr>
+        <w:t xml:space="preserve">Menjaga kualitas dokumentasi dan implementasi sistem. </w:t>
+      </w:r>
+    </w:p>
+    <w:p>
+      <w:pPr>
+        <w:spacing w:after="80" w:line="360" w:lineRule="auto"/>
+        <w:ind w:left="720"/>
+        <w:rPr>
+          <w:rFonts w:ascii="Times New Roman" w:eastAsia="Times New Roman" w:hAnsi="Times New Roman" w:cs="Times New Roman"/>
+          <w:sz w:val="24"/>
+          <w:szCs w:val="24"/>
+          <w:lang w:val="sv-SE"/>
+        </w:rPr>
+      </w:pPr>
+    </w:p>
+    <w:p>
+      <w:pPr>
+        <w:pStyle w:val="Judul2"/>
+        <w:rPr>
+          <w:lang w:val="sv-SE"/>
+        </w:rPr>
+      </w:pPr>
+      <w:r>
+        <w:rPr>
+          <w:lang w:val="sv-SE"/>
+        </w:rPr>
+        <w:t>7.4 Tujuan Pembagian Tugas</w:t>
+      </w:r>
+    </w:p>
+    <w:p>
+      <w:pPr>
+        <w:spacing w:after="80" w:line="360" w:lineRule="auto"/>
+        <w:ind w:left="720" w:hanging="11"/>
+        <w:rPr>
+          <w:rFonts w:ascii="Times New Roman" w:eastAsia="Times New Roman" w:hAnsi="Times New Roman" w:cs="Times New Roman"/>
+          <w:sz w:val="24"/>
+          <w:szCs w:val="24"/>
+          <w:lang w:val="sv-SE"/>
+        </w:rPr>
+      </w:pPr>
+      <w:r>
+        <w:rPr>
+          <w:rFonts w:ascii="Times New Roman" w:eastAsia="Times New Roman" w:hAnsi="Times New Roman" w:cs="Times New Roman"/>
+          <w:sz w:val="24"/>
+          <w:szCs w:val="24"/>
+          <w:lang w:val="sv-SE"/>
+        </w:rPr>
+        <w:t>Pembagian tugas dilakukan dengan tujuan:</w:t>
+      </w:r>
+    </w:p>
+    <w:p>
+      <w:pPr>
+        <w:numPr>
+          <w:ilvl w:val="0"/>
+          <w:numId w:val="4"/>
+        </w:numPr>
+        <w:spacing w:after="80" w:line="360" w:lineRule="auto"/>
+        <w:ind w:hanging="11"/>
+        <w:rPr>
+          <w:rFonts w:ascii="Times New Roman" w:eastAsia="Times New Roman" w:hAnsi="Times New Roman" w:cs="Times New Roman"/>
+          <w:sz w:val="24"/>
+          <w:szCs w:val="24"/>
+          <w:lang w:val="sv-SE"/>
+        </w:rPr>
+      </w:pPr>
+      <w:r>
+        <w:rPr>
+          <w:rFonts w:ascii="Times New Roman" w:eastAsia="Times New Roman" w:hAnsi="Times New Roman" w:cs="Times New Roman"/>
+          <w:sz w:val="24"/>
+          <w:szCs w:val="24"/>
+          <w:lang w:val="sv-SE"/>
+        </w:rPr>
+        <w:t xml:space="preserve">Meningkatkan efektivitas proses pengembangan sistem. </w:t>
+      </w:r>
+    </w:p>
+    <w:p>
+      <w:pPr>
+        <w:numPr>
+          <w:ilvl w:val="0"/>
+          <w:numId w:val="4"/>
+        </w:numPr>
+        <w:spacing w:after="80" w:line="360" w:lineRule="auto"/>
+        <w:ind w:hanging="11"/>
+        <w:rPr>
+          <w:rFonts w:ascii="Times New Roman" w:eastAsia="Times New Roman" w:hAnsi="Times New Roman" w:cs="Times New Roman"/>
+          <w:sz w:val="24"/>
+          <w:szCs w:val="24"/>
+          <w:lang w:val="sv-SE"/>
+        </w:rPr>
+      </w:pPr>
+      <w:r>
+        <w:rPr>
+          <w:rFonts w:ascii="Times New Roman" w:eastAsia="Times New Roman" w:hAnsi="Times New Roman" w:cs="Times New Roman"/>
+          <w:sz w:val="24"/>
+          <w:szCs w:val="24"/>
+          <w:lang w:val="sv-SE"/>
+        </w:rPr>
+        <w:t xml:space="preserve">Mempermudah koordinasi antar anggota tim. </w:t>
+      </w:r>
+    </w:p>
+    <w:p>
+      <w:pPr>
+        <w:numPr>
+          <w:ilvl w:val="0"/>
+          <w:numId w:val="4"/>
+        </w:numPr>
+        <w:spacing w:after="80" w:line="360" w:lineRule="auto"/>
+        <w:ind w:hanging="11"/>
+        <w:rPr>
+          <w:rFonts w:ascii="Times New Roman" w:eastAsia="Times New Roman" w:hAnsi="Times New Roman" w:cs="Times New Roman"/>
+          <w:sz w:val="24"/>
+          <w:szCs w:val="24"/>
+          <w:lang w:val="sv-SE"/>
+        </w:rPr>
+      </w:pPr>
+      <w:r>
+        <w:rPr>
+          <w:rFonts w:ascii="Times New Roman" w:eastAsia="Times New Roman" w:hAnsi="Times New Roman" w:cs="Times New Roman"/>
+          <w:sz w:val="24"/>
+          <w:szCs w:val="24"/>
+          <w:lang w:val="sv-SE"/>
+        </w:rPr>
+        <w:t xml:space="preserve">Memastikan setiap modul dikerjakan oleh anggota yang bertanggung jawab. </w:t>
+      </w:r>
+    </w:p>
+    <w:p>
+      <w:pPr>
+        <w:numPr>
+          <w:ilvl w:val="0"/>
+          <w:numId w:val="4"/>
+        </w:numPr>
+        <w:spacing w:after="80" w:line="360" w:lineRule="auto"/>
+        <w:ind w:hanging="11"/>
+        <w:rPr>
+          <w:rFonts w:ascii="Times New Roman" w:eastAsia="Times New Roman" w:hAnsi="Times New Roman" w:cs="Times New Roman"/>
+          <w:sz w:val="24"/>
+          <w:szCs w:val="24"/>
+          <w:lang w:val="en-ID"/>
+        </w:rPr>
+      </w:pPr>
+      <w:proofErr w:type="spellStart"/>
+      <w:r>
+        <w:rPr>
+          <w:rFonts w:ascii="Times New Roman" w:eastAsia="Times New Roman" w:hAnsi="Times New Roman" w:cs="Times New Roman"/>
+          <w:sz w:val="24"/>
+          <w:szCs w:val="24"/>
+          <w:lang w:val="en-ID"/>
+        </w:rPr>
+        <w:t>Mempercepat</w:t>
+      </w:r>
+      <w:proofErr w:type="spellEnd"/>
+      <w:r>
+        <w:rPr>
+          <w:rFonts w:ascii="Times New Roman" w:eastAsia="Times New Roman" w:hAnsi="Times New Roman" w:cs="Times New Roman"/>
+          <w:sz w:val="24"/>
+          <w:szCs w:val="24"/>
+          <w:lang w:val="en-ID"/>
+        </w:rPr>
+        <w:t xml:space="preserve"> proses </w:t>
+      </w:r>
+      <w:proofErr w:type="spellStart"/>
+      <w:r>
+        <w:rPr>
+          <w:rFonts w:ascii="Times New Roman" w:eastAsia="Times New Roman" w:hAnsi="Times New Roman" w:cs="Times New Roman"/>
+          <w:sz w:val="24"/>
+          <w:szCs w:val="24"/>
+          <w:lang w:val="en-ID"/>
+        </w:rPr>
+        <w:t>penyelesaian</w:t>
+      </w:r>
+      <w:proofErr w:type="spellEnd"/>
+      <w:r>
+        <w:rPr>
+          <w:rFonts w:ascii="Times New Roman" w:eastAsia="Times New Roman" w:hAnsi="Times New Roman" w:cs="Times New Roman"/>
+          <w:sz w:val="24"/>
+          <w:szCs w:val="24"/>
+          <w:lang w:val="en-ID"/>
+        </w:rPr>
+        <w:t xml:space="preserve"> </w:t>
+      </w:r>
+      <w:proofErr w:type="spellStart"/>
+      <w:r>
+        <w:rPr>
+          <w:rFonts w:ascii="Times New Roman" w:eastAsia="Times New Roman" w:hAnsi="Times New Roman" w:cs="Times New Roman"/>
+          <w:sz w:val="24"/>
+          <w:szCs w:val="24"/>
+          <w:lang w:val="en-ID"/>
+        </w:rPr>
+        <w:t>proyek</w:t>
+      </w:r>
+      <w:proofErr w:type="spellEnd"/>
+      <w:r>
+        <w:rPr>
+          <w:rFonts w:ascii="Times New Roman" w:eastAsia="Times New Roman" w:hAnsi="Times New Roman" w:cs="Times New Roman"/>
+          <w:sz w:val="24"/>
+          <w:szCs w:val="24"/>
+          <w:lang w:val="en-ID"/>
+        </w:rPr>
+        <w:t xml:space="preserve"> </w:t>
+      </w:r>
+      <w:proofErr w:type="spellStart"/>
+      <w:r>
+        <w:rPr>
+          <w:rFonts w:ascii="Times New Roman" w:eastAsia="Times New Roman" w:hAnsi="Times New Roman" w:cs="Times New Roman"/>
+          <w:sz w:val="24"/>
+          <w:szCs w:val="24"/>
+          <w:lang w:val="en-ID"/>
+        </w:rPr>
+        <w:t>sesuai</w:t>
+      </w:r>
+      <w:proofErr w:type="spellEnd"/>
+      <w:r>
+        <w:rPr>
+          <w:rFonts w:ascii="Times New Roman" w:eastAsia="Times New Roman" w:hAnsi="Times New Roman" w:cs="Times New Roman"/>
+          <w:sz w:val="24"/>
+          <w:szCs w:val="24"/>
+          <w:lang w:val="en-ID"/>
+        </w:rPr>
+        <w:t xml:space="preserve"> timeline yang </w:t>
+      </w:r>
+      <w:proofErr w:type="spellStart"/>
+      <w:r>
+        <w:rPr>
+          <w:rFonts w:ascii="Times New Roman" w:eastAsia="Times New Roman" w:hAnsi="Times New Roman" w:cs="Times New Roman"/>
+          <w:sz w:val="24"/>
+          <w:szCs w:val="24"/>
+          <w:lang w:val="en-ID"/>
+        </w:rPr>
+        <w:t>telah</w:t>
+      </w:r>
+      <w:proofErr w:type="spellEnd"/>
+      <w:r>
+        <w:rPr>
+          <w:rFonts w:ascii="Times New Roman" w:eastAsia="Times New Roman" w:hAnsi="Times New Roman" w:cs="Times New Roman"/>
+          <w:sz w:val="24"/>
+          <w:szCs w:val="24"/>
+          <w:lang w:val="en-ID"/>
+        </w:rPr>
+        <w:t xml:space="preserve"> </w:t>
+      </w:r>
+      <w:proofErr w:type="spellStart"/>
+      <w:r>
+        <w:rPr>
+          <w:rFonts w:ascii="Times New Roman" w:eastAsia="Times New Roman" w:hAnsi="Times New Roman" w:cs="Times New Roman"/>
+          <w:sz w:val="24"/>
+          <w:szCs w:val="24"/>
+          <w:lang w:val="en-ID"/>
+        </w:rPr>
+        <w:t>ditentukan</w:t>
+      </w:r>
+      <w:proofErr w:type="spellEnd"/>
+      <w:r>
+        <w:rPr>
+          <w:rFonts w:ascii="Times New Roman" w:eastAsia="Times New Roman" w:hAnsi="Times New Roman" w:cs="Times New Roman"/>
+          <w:sz w:val="24"/>
+          <w:szCs w:val="24"/>
+          <w:lang w:val="en-ID"/>
+        </w:rPr>
+        <w:t xml:space="preserve">. </w:t>
+      </w:r>
+    </w:p>
+    <w:p>
+      <w:pPr>
+        <w:spacing w:after="80" w:line="360" w:lineRule="auto"/>
+        <w:ind w:left="720" w:hanging="11"/>
+        <w:rPr>
+          <w:rFonts w:ascii="Times New Roman" w:eastAsia="Times New Roman" w:hAnsi="Times New Roman" w:cs="Times New Roman"/>
+          <w:sz w:val="24"/>
+          <w:szCs w:val="24"/>
+          <w:lang w:val="en-ID"/>
+        </w:rPr>
+      </w:pPr>
+    </w:p>
+    <w:p>
+      <w:pPr>
+        <w:spacing w:after="80" w:line="360" w:lineRule="auto"/>
+        <w:ind w:left="720" w:hanging="11"/>
+        <w:rPr>
+          <w:rFonts w:ascii="Times New Roman" w:eastAsia="Times New Roman" w:hAnsi="Times New Roman" w:cs="Times New Roman"/>
+          <w:sz w:val="24"/>
+          <w:szCs w:val="24"/>
+          <w:lang w:val="en-ID"/>
+        </w:rPr>
+      </w:pPr>
+    </w:p>
+    <w:p>
+      <w:pPr>
+        <w:spacing w:after="80" w:line="360" w:lineRule="auto"/>
+        <w:ind w:left="720" w:hanging="240"/>
+        <w:rPr>
+          <w:rFonts w:ascii="Times New Roman" w:eastAsia="Times New Roman" w:hAnsi="Times New Roman" w:cs="Times New Roman"/>
+          <w:sz w:val="24"/>
+          <w:szCs w:val="24"/>
+          <w:lang w:val="en-ID"/>
+        </w:rPr>
+      </w:pPr>
+    </w:p>
+    <w:p>
+      <w:pPr>
         <w:spacing w:line="360" w:lineRule="auto"/>
         <w:rPr>
           <w:rFonts w:ascii="Times New Roman" w:eastAsia="Times New Roman" w:hAnsi="Times New Roman" w:cs="Times New Roman"/>
@@ -25285,16 +27409,6 @@
         </w:rPr>
         <w:t xml:space="preserve"> </w:t>
       </w:r>
-    </w:p>
-    <w:p>
-      <w:pPr>
-        <w:spacing w:before="240" w:after="240" w:line="360" w:lineRule="auto"/>
-        <w:rPr>
-          <w:rFonts w:ascii="Times New Roman" w:eastAsia="Times New Roman" w:hAnsi="Times New Roman" w:cs="Times New Roman"/>
-          <w:sz w:val="24"/>
-          <w:szCs w:val="24"/>
-        </w:rPr>
-      </w:pPr>
     </w:p>
     <w:p>
       <w:pPr>
@@ -25345,7 +27459,7 @@
       </w:r>
       <w:r>
         <w:pict w14:anchorId="769F1FC0">
-          <v:rect id="_x0000_i1032" style="width:0;height:1.5pt" o:hralign="center" o:hrstd="t" o:hr="t" fillcolor="#a0a0a0" stroked="f"/>
+          <v:rect id="_x0000_i1252" style="width:0;height:1.5pt" o:hralign="center" o:hrstd="t" o:hr="t" fillcolor="#a0a0a0" stroked="f"/>
         </w:pict>
       </w:r>
     </w:p>
@@ -26549,7 +28663,6 @@
                 <w:sz w:val="24"/>
                 <w:szCs w:val="24"/>
               </w:rPr>
-              <w:lastRenderedPageBreak/>
               <w:t>REQ-PO-007</w:t>
             </w:r>
           </w:p>
@@ -27900,7 +30013,6 @@
                 <w:sz w:val="24"/>
                 <w:szCs w:val="24"/>
               </w:rPr>
-              <w:lastRenderedPageBreak/>
               <w:t>REQ-PO-016</w:t>
             </w:r>
           </w:p>
@@ -29281,7 +31393,6 @@
                 <w:sz w:val="24"/>
                 <w:szCs w:val="24"/>
               </w:rPr>
-              <w:lastRenderedPageBreak/>
               <w:t>REQ-PO-025</w:t>
             </w:r>
           </w:p>
@@ -29769,7 +31880,7 @@
       </w:r>
       <w:r>
         <w:pict w14:anchorId="5191ED3A">
-          <v:rect id="_x0000_i1033" style="width:0;height:1.5pt" o:hralign="center" o:hrstd="t" o:hr="t" fillcolor="#a0a0a0" stroked="f"/>
+          <v:rect id="_x0000_i1253" style="width:0;height:1.5pt" o:hralign="center" o:hrstd="t" o:hr="t" fillcolor="#a0a0a0" stroked="f"/>
         </w:pict>
       </w:r>
     </w:p>
@@ -30421,7 +32532,6 @@
                 <w:sz w:val="24"/>
                 <w:szCs w:val="24"/>
               </w:rPr>
-              <w:lastRenderedPageBreak/>
               <w:t>RBAC</w:t>
             </w:r>
           </w:p>
@@ -31135,7 +33245,7 @@
       </w:r>
       <w:r>
         <w:pict w14:anchorId="6646BA3C">
-          <v:rect id="_x0000_i1034" style="width:0;height:1.5pt" o:hralign="center" o:hrstd="t" o:hr="t" fillcolor="#a0a0a0" stroked="f"/>
+          <v:rect id="_x0000_i1254" style="width:0;height:1.5pt" o:hralign="center" o:hrstd="t" o:hr="t" fillcolor="#a0a0a0" stroked="f"/>
         </w:pict>
       </w:r>
     </w:p>
@@ -32135,7 +34245,6 @@
                 <w:sz w:val="24"/>
                 <w:szCs w:val="24"/>
               </w:rPr>
-              <w:lastRenderedPageBreak/>
               <w:t>TBD-PO-005</w:t>
             </w:r>
           </w:p>
@@ -32722,7 +34831,7 @@
       </w:r>
       <w:r>
         <w:pict w14:anchorId="42638CC7">
-          <v:rect id="_x0000_i1035" style="width:0;height:1.5pt" o:hralign="center" o:hrstd="t" o:hr="t" fillcolor="#a0a0a0" stroked="f"/>
+          <v:rect id="_x0000_i1255" style="width:0;height:1.5pt" o:hralign="center" o:hrstd="t" o:hr="t" fillcolor="#a0a0a0" stroked="f"/>
         </w:pict>
       </w:r>
     </w:p>
@@ -32816,7 +34925,7 @@
                     <pic:cNvPicPr preferRelativeResize="0"/>
                   </pic:nvPicPr>
                   <pic:blipFill>
-                    <a:blip r:embed="rId19"/>
+                    <a:blip r:embed="rId20"/>
                     <a:srcRect/>
                     <a:stretch>
                       <a:fillRect/>
@@ -32909,7 +35018,6 @@
           <w:rFonts w:ascii="Times New Roman" w:eastAsia="Times New Roman" w:hAnsi="Times New Roman" w:cs="Times New Roman"/>
           <w:noProof/>
         </w:rPr>
-        <w:lastRenderedPageBreak/>
         <w:drawing>
           <wp:inline distT="114300" distB="114300" distL="114300" distR="114300" wp14:anchorId="0CCD92E3" wp14:editId="4588C038">
             <wp:extent cx="4328670" cy="3304998"/>
@@ -32924,7 +35032,7 @@
                     <pic:cNvPicPr preferRelativeResize="0"/>
                   </pic:nvPicPr>
                   <pic:blipFill>
-                    <a:blip r:embed="rId20"/>
+                    <a:blip r:embed="rId21"/>
                     <a:srcRect/>
                     <a:stretch>
                       <a:fillRect/>
@@ -33015,7 +35123,7 @@
                     <pic:cNvPicPr preferRelativeResize="0"/>
                   </pic:nvPicPr>
                   <pic:blipFill>
-                    <a:blip r:embed="rId21"/>
+                    <a:blip r:embed="rId22"/>
                     <a:srcRect/>
                     <a:stretch>
                       <a:fillRect/>
@@ -33117,7 +35225,6 @@
           <w:sz w:val="28"/>
           <w:szCs w:val="28"/>
         </w:rPr>
-        <w:lastRenderedPageBreak/>
         <w:drawing>
           <wp:inline distT="114300" distB="114300" distL="114300" distR="114300" wp14:anchorId="632518A4" wp14:editId="212F41F8">
             <wp:extent cx="6254251" cy="3464657"/>
@@ -33132,7 +35239,7 @@
                     <pic:cNvPicPr preferRelativeResize="0"/>
                   </pic:nvPicPr>
                   <pic:blipFill>
-                    <a:blip r:embed="rId22"/>
+                    <a:blip r:embed="rId23"/>
                     <a:srcRect/>
                     <a:stretch>
                       <a:fillRect/>
@@ -33180,7 +35287,7 @@
       </w:r>
       <w:r>
         <w:pict w14:anchorId="2D027A45">
-          <v:rect id="_x0000_i1036" style="width:0;height:1.5pt" o:hralign="center" o:hrstd="t" o:hr="t" fillcolor="#a0a0a0" stroked="f"/>
+          <v:rect id="_x0000_i1256" style="width:0;height:1.5pt" o:hralign="center" o:hrstd="t" o:hr="t" fillcolor="#a0a0a0" stroked="f"/>
         </w:pict>
       </w:r>
     </w:p>
@@ -33211,7 +35318,7 @@
                     <pic:cNvPicPr preferRelativeResize="0"/>
                   </pic:nvPicPr>
                   <pic:blipFill>
-                    <a:blip r:embed="rId23"/>
+                    <a:blip r:embed="rId24"/>
                     <a:srcRect/>
                     <a:stretch>
                       <a:fillRect/>
@@ -33415,7 +35522,7 @@
       </w:r>
       <w:r>
         <w:pict w14:anchorId="78206FA3">
-          <v:rect id="_x0000_i1037" style="width:0;height:1.5pt" o:hralign="center" o:hrstd="t" o:hr="t" fillcolor="#a0a0a0" stroked="f"/>
+          <v:rect id="_x0000_i1245" style="width:0;height:1.5pt" o:hralign="center" o:hrstd="t" o:hr="t" fillcolor="#a0a0a0" stroked="f"/>
         </w:pict>
       </w:r>
     </w:p>
@@ -33460,7 +35567,7 @@
                     <pic:cNvPicPr preferRelativeResize="0"/>
                   </pic:nvPicPr>
                   <pic:blipFill>
-                    <a:blip r:embed="rId24"/>
+                    <a:blip r:embed="rId25"/>
                     <a:srcRect/>
                     <a:stretch>
                       <a:fillRect/>
@@ -33499,7 +35606,6 @@
           <w:sz w:val="28"/>
           <w:szCs w:val="28"/>
         </w:rPr>
-        <w:lastRenderedPageBreak/>
         <w:t xml:space="preserve">Diagram Arsitektur : </w:t>
       </w:r>
     </w:p>
@@ -33532,7 +35638,7 @@
                     <pic:cNvPicPr preferRelativeResize="0"/>
                   </pic:nvPicPr>
                   <pic:blipFill>
-                    <a:blip r:embed="rId25"/>
+                    <a:blip r:embed="rId26"/>
                     <a:srcRect/>
                     <a:stretch>
                       <a:fillRect/>
@@ -33556,10 +35662,10 @@
       </w:r>
     </w:p>
     <w:sectPr>
-      <w:headerReference w:type="default" r:id="rId26"/>
-      <w:footerReference w:type="default" r:id="rId27"/>
-      <w:headerReference w:type="first" r:id="rId28"/>
-      <w:footerReference w:type="first" r:id="rId29"/>
+      <w:headerReference w:type="default" r:id="rId27"/>
+      <w:footerReference w:type="default" r:id="rId28"/>
+      <w:headerReference w:type="first" r:id="rId29"/>
+      <w:footerReference w:type="first" r:id="rId30"/>
       <w:pgSz w:w="11909" w:h="16834"/>
       <w:pgMar w:top="1440" w:right="1440" w:bottom="1440" w:left="1440" w:header="720" w:footer="720" w:gutter="0"/>
       <w:pgNumType w:start="1"/>
@@ -33782,6 +35888,155 @@
     </w:lvl>
   </w:abstractNum>
   <w:abstractNum w:abstractNumId="1" w15:restartNumberingAfterBreak="0">
+    <w:nsid w:val="1B570864"/>
+    <w:multiLevelType w:val="multilevel"/>
+    <w:tmpl w:val="0F3CF014"/>
+    <w:lvl w:ilvl="0">
+      <w:start w:val="1"/>
+      <w:numFmt w:val="bullet"/>
+      <w:lvlText w:val=""/>
+      <w:lvlJc w:val="left"/>
+      <w:pPr>
+        <w:tabs>
+          <w:tab w:val="num" w:pos="720"/>
+        </w:tabs>
+        <w:ind w:left="720" w:hanging="360"/>
+      </w:pPr>
+      <w:rPr>
+        <w:rFonts w:ascii="Symbol" w:hAnsi="Symbol" w:hint="default"/>
+        <w:sz w:val="20"/>
+      </w:rPr>
+    </w:lvl>
+    <w:lvl w:ilvl="1" w:tentative="1">
+      <w:start w:val="1"/>
+      <w:numFmt w:val="bullet"/>
+      <w:lvlText w:val="o"/>
+      <w:lvlJc w:val="left"/>
+      <w:pPr>
+        <w:tabs>
+          <w:tab w:val="num" w:pos="1440"/>
+        </w:tabs>
+        <w:ind w:left="1440" w:hanging="360"/>
+      </w:pPr>
+      <w:rPr>
+        <w:rFonts w:ascii="Courier New" w:hAnsi="Courier New" w:hint="default"/>
+        <w:sz w:val="20"/>
+      </w:rPr>
+    </w:lvl>
+    <w:lvl w:ilvl="2" w:tentative="1">
+      <w:start w:val="1"/>
+      <w:numFmt w:val="bullet"/>
+      <w:lvlText w:val=""/>
+      <w:lvlJc w:val="left"/>
+      <w:pPr>
+        <w:tabs>
+          <w:tab w:val="num" w:pos="2160"/>
+        </w:tabs>
+        <w:ind w:left="2160" w:hanging="360"/>
+      </w:pPr>
+      <w:rPr>
+        <w:rFonts w:ascii="Wingdings" w:hAnsi="Wingdings" w:hint="default"/>
+        <w:sz w:val="20"/>
+      </w:rPr>
+    </w:lvl>
+    <w:lvl w:ilvl="3" w:tentative="1">
+      <w:start w:val="1"/>
+      <w:numFmt w:val="bullet"/>
+      <w:lvlText w:val=""/>
+      <w:lvlJc w:val="left"/>
+      <w:pPr>
+        <w:tabs>
+          <w:tab w:val="num" w:pos="2880"/>
+        </w:tabs>
+        <w:ind w:left="2880" w:hanging="360"/>
+      </w:pPr>
+      <w:rPr>
+        <w:rFonts w:ascii="Wingdings" w:hAnsi="Wingdings" w:hint="default"/>
+        <w:sz w:val="20"/>
+      </w:rPr>
+    </w:lvl>
+    <w:lvl w:ilvl="4" w:tentative="1">
+      <w:start w:val="1"/>
+      <w:numFmt w:val="bullet"/>
+      <w:lvlText w:val=""/>
+      <w:lvlJc w:val="left"/>
+      <w:pPr>
+        <w:tabs>
+          <w:tab w:val="num" w:pos="3600"/>
+        </w:tabs>
+        <w:ind w:left="3600" w:hanging="360"/>
+      </w:pPr>
+      <w:rPr>
+        <w:rFonts w:ascii="Wingdings" w:hAnsi="Wingdings" w:hint="default"/>
+        <w:sz w:val="20"/>
+      </w:rPr>
+    </w:lvl>
+    <w:lvl w:ilvl="5" w:tentative="1">
+      <w:start w:val="1"/>
+      <w:numFmt w:val="bullet"/>
+      <w:lvlText w:val=""/>
+      <w:lvlJc w:val="left"/>
+      <w:pPr>
+        <w:tabs>
+          <w:tab w:val="num" w:pos="4320"/>
+        </w:tabs>
+        <w:ind w:left="4320" w:hanging="360"/>
+      </w:pPr>
+      <w:rPr>
+        <w:rFonts w:ascii="Wingdings" w:hAnsi="Wingdings" w:hint="default"/>
+        <w:sz w:val="20"/>
+      </w:rPr>
+    </w:lvl>
+    <w:lvl w:ilvl="6" w:tentative="1">
+      <w:start w:val="1"/>
+      <w:numFmt w:val="bullet"/>
+      <w:lvlText w:val=""/>
+      <w:lvlJc w:val="left"/>
+      <w:pPr>
+        <w:tabs>
+          <w:tab w:val="num" w:pos="5040"/>
+        </w:tabs>
+        <w:ind w:left="5040" w:hanging="360"/>
+      </w:pPr>
+      <w:rPr>
+        <w:rFonts w:ascii="Wingdings" w:hAnsi="Wingdings" w:hint="default"/>
+        <w:sz w:val="20"/>
+      </w:rPr>
+    </w:lvl>
+    <w:lvl w:ilvl="7" w:tentative="1">
+      <w:start w:val="1"/>
+      <w:numFmt w:val="bullet"/>
+      <w:lvlText w:val=""/>
+      <w:lvlJc w:val="left"/>
+      <w:pPr>
+        <w:tabs>
+          <w:tab w:val="num" w:pos="5760"/>
+        </w:tabs>
+        <w:ind w:left="5760" w:hanging="360"/>
+      </w:pPr>
+      <w:rPr>
+        <w:rFonts w:ascii="Wingdings" w:hAnsi="Wingdings" w:hint="default"/>
+        <w:sz w:val="20"/>
+      </w:rPr>
+    </w:lvl>
+    <w:lvl w:ilvl="8" w:tentative="1">
+      <w:start w:val="1"/>
+      <w:numFmt w:val="bullet"/>
+      <w:lvlText w:val=""/>
+      <w:lvlJc w:val="left"/>
+      <w:pPr>
+        <w:tabs>
+          <w:tab w:val="num" w:pos="6480"/>
+        </w:tabs>
+        <w:ind w:left="6480" w:hanging="360"/>
+      </w:pPr>
+      <w:rPr>
+        <w:rFonts w:ascii="Wingdings" w:hAnsi="Wingdings" w:hint="default"/>
+        <w:sz w:val="20"/>
+      </w:rPr>
+    </w:lvl>
+  </w:abstractNum>
+  <w:abstractNum w:abstractNumId="2" w15:restartNumberingAfterBreak="0">
     <w:nsid w:val="502F68A2"/>
     <w:multiLevelType w:val="multilevel"/>
     <w:tmpl w:val="86B66098"/>
@@ -33894,11 +36149,130 @@
       </w:rPr>
     </w:lvl>
   </w:abstractNum>
+  <w:abstractNum w:abstractNumId="3" w15:restartNumberingAfterBreak="0">
+    <w:nsid w:val="658029F3"/>
+    <w:multiLevelType w:val="multilevel"/>
+    <w:tmpl w:val="0F22DA04"/>
+    <w:lvl w:ilvl="0">
+      <w:start w:val="1"/>
+      <w:numFmt w:val="decimal"/>
+      <w:lvlText w:val="%1."/>
+      <w:lvlJc w:val="left"/>
+      <w:pPr>
+        <w:tabs>
+          <w:tab w:val="num" w:pos="720"/>
+        </w:tabs>
+        <w:ind w:left="720" w:hanging="360"/>
+      </w:pPr>
+    </w:lvl>
+    <w:lvl w:ilvl="1" w:tentative="1">
+      <w:start w:val="1"/>
+      <w:numFmt w:val="decimal"/>
+      <w:lvlText w:val="%2."/>
+      <w:lvlJc w:val="left"/>
+      <w:pPr>
+        <w:tabs>
+          <w:tab w:val="num" w:pos="1440"/>
+        </w:tabs>
+        <w:ind w:left="1440" w:hanging="360"/>
+      </w:pPr>
+    </w:lvl>
+    <w:lvl w:ilvl="2" w:tentative="1">
+      <w:start w:val="1"/>
+      <w:numFmt w:val="decimal"/>
+      <w:lvlText w:val="%3."/>
+      <w:lvlJc w:val="left"/>
+      <w:pPr>
+        <w:tabs>
+          <w:tab w:val="num" w:pos="2160"/>
+        </w:tabs>
+        <w:ind w:left="2160" w:hanging="360"/>
+      </w:pPr>
+    </w:lvl>
+    <w:lvl w:ilvl="3" w:tentative="1">
+      <w:start w:val="1"/>
+      <w:numFmt w:val="decimal"/>
+      <w:lvlText w:val="%4."/>
+      <w:lvlJc w:val="left"/>
+      <w:pPr>
+        <w:tabs>
+          <w:tab w:val="num" w:pos="2880"/>
+        </w:tabs>
+        <w:ind w:left="2880" w:hanging="360"/>
+      </w:pPr>
+    </w:lvl>
+    <w:lvl w:ilvl="4" w:tentative="1">
+      <w:start w:val="1"/>
+      <w:numFmt w:val="decimal"/>
+      <w:lvlText w:val="%5."/>
+      <w:lvlJc w:val="left"/>
+      <w:pPr>
+        <w:tabs>
+          <w:tab w:val="num" w:pos="3600"/>
+        </w:tabs>
+        <w:ind w:left="3600" w:hanging="360"/>
+      </w:pPr>
+    </w:lvl>
+    <w:lvl w:ilvl="5" w:tentative="1">
+      <w:start w:val="1"/>
+      <w:numFmt w:val="decimal"/>
+      <w:lvlText w:val="%6."/>
+      <w:lvlJc w:val="left"/>
+      <w:pPr>
+        <w:tabs>
+          <w:tab w:val="num" w:pos="4320"/>
+        </w:tabs>
+        <w:ind w:left="4320" w:hanging="360"/>
+      </w:pPr>
+    </w:lvl>
+    <w:lvl w:ilvl="6" w:tentative="1">
+      <w:start w:val="1"/>
+      <w:numFmt w:val="decimal"/>
+      <w:lvlText w:val="%7."/>
+      <w:lvlJc w:val="left"/>
+      <w:pPr>
+        <w:tabs>
+          <w:tab w:val="num" w:pos="5040"/>
+        </w:tabs>
+        <w:ind w:left="5040" w:hanging="360"/>
+      </w:pPr>
+    </w:lvl>
+    <w:lvl w:ilvl="7" w:tentative="1">
+      <w:start w:val="1"/>
+      <w:numFmt w:val="decimal"/>
+      <w:lvlText w:val="%8."/>
+      <w:lvlJc w:val="left"/>
+      <w:pPr>
+        <w:tabs>
+          <w:tab w:val="num" w:pos="5760"/>
+        </w:tabs>
+        <w:ind w:left="5760" w:hanging="360"/>
+      </w:pPr>
+    </w:lvl>
+    <w:lvl w:ilvl="8" w:tentative="1">
+      <w:start w:val="1"/>
+      <w:numFmt w:val="decimal"/>
+      <w:lvlText w:val="%9."/>
+      <w:lvlJc w:val="left"/>
+      <w:pPr>
+        <w:tabs>
+          <w:tab w:val="num" w:pos="6480"/>
+        </w:tabs>
+        <w:ind w:left="6480" w:hanging="360"/>
+      </w:pPr>
+    </w:lvl>
+  </w:abstractNum>
   <w:num w:numId="1" w16cid:durableId="1030837515">
-    <w:abstractNumId w:val="1"/>
+    <w:abstractNumId w:val="2"/>
   </w:num>
   <w:num w:numId="2" w16cid:durableId="1986087012">
     <w:abstractNumId w:val="0"/>
+  </w:num>
+  <w:num w:numId="3" w16cid:durableId="566690128">
+    <w:abstractNumId w:val="3"/>
+  </w:num>
+  <w:num w:numId="4" w16cid:durableId="1513109509">
+    <w:abstractNumId w:val="1"/>
   </w:num>
 </w:numbering>
 </file>
@@ -34423,7 +36797,6 @@
   <w:style w:type="character" w:default="1" w:styleId="FontParagrafDefault">
     <w:name w:val="Default Paragraph Font"/>
     <w:uiPriority w:val="1"/>
-    <w:semiHidden/>
     <w:unhideWhenUsed/>
   </w:style>
   <w:style w:type="table" w:default="1" w:styleId="TabelNormal">
@@ -34668,6 +37041,89 @@
       <w:tblStyleRowBandSize w:val="1"/>
       <w:tblStyleColBandSize w:val="1"/>
     </w:tblPr>
+  </w:style>
+  <w:style w:type="paragraph" w:styleId="JudulTOC">
+    <w:name w:val="TOC Heading"/>
+    <w:basedOn w:val="Judul1"/>
+    <w:next w:val="Normal"/>
+    <w:uiPriority w:val="39"/>
+    <w:unhideWhenUsed/>
+    <w:qFormat/>
+    <w:rsid w:val="009B157C"/>
+    <w:pPr>
+      <w:spacing w:before="240" w:after="0" w:line="259" w:lineRule="auto"/>
+      <w:outlineLvl w:val="9"/>
+    </w:pPr>
+    <w:rPr>
+      <w:rFonts w:asciiTheme="majorHAnsi" w:eastAsiaTheme="majorEastAsia" w:hAnsiTheme="majorHAnsi" w:cstheme="majorBidi"/>
+      <w:b w:val="0"/>
+      <w:bCs w:val="0"/>
+      <w:color w:val="365F91" w:themeColor="accent1" w:themeShade="BF"/>
+      <w:sz w:val="32"/>
+      <w:szCs w:val="32"/>
+      <w:lang w:val="en-ID" w:eastAsia="en-ID"/>
+    </w:rPr>
+  </w:style>
+  <w:style w:type="paragraph" w:styleId="TOC2">
+    <w:name w:val="toc 2"/>
+    <w:basedOn w:val="Normal"/>
+    <w:next w:val="Normal"/>
+    <w:autoRedefine/>
+    <w:uiPriority w:val="39"/>
+    <w:unhideWhenUsed/>
+    <w:rsid w:val="009B157C"/>
+    <w:pPr>
+      <w:spacing w:after="100" w:line="259" w:lineRule="auto"/>
+      <w:ind w:left="220"/>
+    </w:pPr>
+    <w:rPr>
+      <w:rFonts w:asciiTheme="minorHAnsi" w:eastAsiaTheme="minorEastAsia" w:hAnsiTheme="minorHAnsi" w:cs="Times New Roman"/>
+      <w:lang w:val="en-ID" w:eastAsia="en-ID"/>
+    </w:rPr>
+  </w:style>
+  <w:style w:type="paragraph" w:styleId="TOC1">
+    <w:name w:val="toc 1"/>
+    <w:basedOn w:val="Normal"/>
+    <w:next w:val="Normal"/>
+    <w:autoRedefine/>
+    <w:uiPriority w:val="39"/>
+    <w:unhideWhenUsed/>
+    <w:rsid w:val="009B157C"/>
+    <w:pPr>
+      <w:spacing w:after="100" w:line="259" w:lineRule="auto"/>
+    </w:pPr>
+    <w:rPr>
+      <w:rFonts w:asciiTheme="minorHAnsi" w:eastAsiaTheme="minorEastAsia" w:hAnsiTheme="minorHAnsi" w:cs="Times New Roman"/>
+      <w:lang w:val="en-ID" w:eastAsia="en-ID"/>
+    </w:rPr>
+  </w:style>
+  <w:style w:type="paragraph" w:styleId="TOC3">
+    <w:name w:val="toc 3"/>
+    <w:basedOn w:val="Normal"/>
+    <w:next w:val="Normal"/>
+    <w:autoRedefine/>
+    <w:uiPriority w:val="39"/>
+    <w:unhideWhenUsed/>
+    <w:rsid w:val="009B157C"/>
+    <w:pPr>
+      <w:spacing w:after="100" w:line="259" w:lineRule="auto"/>
+      <w:ind w:left="440"/>
+    </w:pPr>
+    <w:rPr>
+      <w:rFonts w:asciiTheme="minorHAnsi" w:eastAsiaTheme="minorEastAsia" w:hAnsiTheme="minorHAnsi" w:cs="Times New Roman"/>
+      <w:lang w:val="en-ID" w:eastAsia="en-ID"/>
+    </w:rPr>
+  </w:style>
+  <w:style w:type="character" w:styleId="Hyperlink">
+    <w:name w:val="Hyperlink"/>
+    <w:basedOn w:val="FontParagrafDefault"/>
+    <w:uiPriority w:val="99"/>
+    <w:unhideWhenUsed/>
+    <w:rsid w:val="009B157C"/>
+    <w:rPr>
+      <w:color w:val="0000FF" w:themeColor="hyperlink"/>
+      <w:u w:val="single"/>
+    </w:rPr>
   </w:style>
 </w:styles>
 </file>
@@ -34990,4 +37446,16 @@
   </a:objectDefaults>
   <a:extraClrSchemeLst/>
 </a:theme>
+</file>
+
+<file path=customXml/item1.xml><?xml version="1.0" encoding="utf-8"?>
+<b:Sources xmlns:b="http://schemas.openxmlformats.org/officeDocument/2006/bibliography" xmlns="http://schemas.openxmlformats.org/officeDocument/2006/bibliography" SelectedStyle="\APASixthEditionOfficeOnline.xsl" StyleName="APA" Version="6"/>
+</file>
+
+<file path=customXml/itemProps1.xml><?xml version="1.0" encoding="utf-8"?>
+<ds:datastoreItem xmlns:ds="http://schemas.openxmlformats.org/officeDocument/2006/customXml" ds:itemID="{90118D95-7D8C-4ECA-960C-32A7E9547059}">
+  <ds:schemaRefs>
+    <ds:schemaRef ds:uri="http://schemas.openxmlformats.org/officeDocument/2006/bibliography"/>
+  </ds:schemaRefs>
+</ds:datastoreItem>
 </file>
</xml_diff>